<commit_message>
Adam doc update - extra details
</commit_message>
<xml_diff>
--- a/ADAM optimizer.docx
+++ b/ADAM optimizer.docx
@@ -11,7 +11,6 @@
           <w:bCs/>
           <w:sz w:val="26"/>
           <w:szCs w:val="28"/>
-          <w:lang/>
         </w:rPr>
       </w:pPr>
       <w:r>
@@ -21,7 +20,6 @@
           <w:bCs/>
           <w:sz w:val="34"/>
           <w:szCs w:val="44"/>
-          <w:lang/>
         </w:rPr>
         <w:t>A</w:t>
       </w:r>
@@ -32,7 +30,6 @@
           <w:bCs/>
           <w:sz w:val="26"/>
           <w:szCs w:val="28"/>
-          <w:lang/>
         </w:rPr>
         <w:t xml:space="preserve">DAM </w:t>
       </w:r>
@@ -43,7 +40,6 @@
           <w:bCs/>
           <w:sz w:val="34"/>
           <w:szCs w:val="44"/>
-          <w:lang/>
         </w:rPr>
         <w:t>O</w:t>
       </w:r>
@@ -54,7 +50,6 @@
           <w:bCs/>
           <w:sz w:val="26"/>
           <w:szCs w:val="28"/>
-          <w:lang/>
         </w:rPr>
         <w:t>PTIMIZER</w:t>
       </w:r>
@@ -68,7 +63,6 @@
           <w:rFonts w:ascii="Computer modern" w:hAnsi="Computer modern"/>
           <w:sz w:val="26"/>
           <w:szCs w:val="28"/>
-          <w:lang/>
         </w:rPr>
         <w:t>Adam</w:t>
       </w:r>
@@ -77,7 +71,6 @@
           <w:rFonts w:ascii="Computer modern" w:hAnsi="Computer modern"/>
           <w:sz w:val="26"/>
           <w:szCs w:val="28"/>
-          <w:lang/>
         </w:rPr>
         <w:t xml:space="preserve"> (</w:t>
       </w:r>
@@ -87,7 +80,6 @@
           <w:sz w:val="26"/>
           <w:szCs w:val="28"/>
           <w:u w:val="single"/>
-          <w:lang/>
         </w:rPr>
         <w:t>ada</w:t>
       </w:r>
@@ -96,7 +88,6 @@
           <w:rFonts w:ascii="Computer modern" w:hAnsi="Computer modern"/>
           <w:sz w:val="26"/>
           <w:szCs w:val="28"/>
-          <w:lang/>
         </w:rPr>
         <w:t xml:space="preserve">ptive </w:t>
       </w:r>
@@ -106,7 +97,6 @@
           <w:sz w:val="26"/>
           <w:szCs w:val="28"/>
           <w:u w:val="single"/>
-          <w:lang/>
         </w:rPr>
         <w:t>m</w:t>
       </w:r>
@@ -115,7 +105,6 @@
           <w:rFonts w:ascii="Computer modern" w:hAnsi="Computer modern"/>
           <w:sz w:val="26"/>
           <w:szCs w:val="28"/>
-          <w:lang/>
         </w:rPr>
         <w:t>oment estimation</w:t>
       </w:r>
@@ -124,7 +113,6 @@
           <w:rFonts w:ascii="Computer modern" w:hAnsi="Computer modern"/>
           <w:sz w:val="26"/>
           <w:szCs w:val="28"/>
-          <w:lang/>
         </w:rPr>
         <w:t>)</w:t>
       </w:r>
@@ -133,7 +121,6 @@
           <w:rFonts w:ascii="Computer modern" w:hAnsi="Computer modern"/>
           <w:sz w:val="26"/>
           <w:szCs w:val="28"/>
-          <w:lang/>
         </w:rPr>
         <w:t xml:space="preserve"> </w:t>
       </w:r>
@@ -142,7 +129,6 @@
           <w:rFonts w:ascii="Computer modern" w:hAnsi="Computer modern"/>
           <w:sz w:val="26"/>
           <w:szCs w:val="28"/>
-          <w:lang/>
         </w:rPr>
         <w:t>an algorithm for first-order gradient-based optimization of</w:t>
       </w:r>
@@ -151,7 +137,6 @@
           <w:rFonts w:ascii="Computer modern" w:hAnsi="Computer modern"/>
           <w:sz w:val="26"/>
           <w:szCs w:val="28"/>
-          <w:lang/>
         </w:rPr>
         <w:t xml:space="preserve"> </w:t>
       </w:r>
@@ -160,7 +145,6 @@
           <w:rFonts w:ascii="Computer modern" w:hAnsi="Computer modern"/>
           <w:sz w:val="26"/>
           <w:szCs w:val="28"/>
-          <w:lang/>
         </w:rPr>
         <w:t>stochastic objective functions</w:t>
       </w:r>
@@ -169,7 +153,6 @@
           <w:rFonts w:ascii="Computer modern" w:hAnsi="Computer modern"/>
           <w:sz w:val="26"/>
           <w:szCs w:val="28"/>
-          <w:lang/>
         </w:rPr>
         <w:t xml:space="preserve">. </w:t>
       </w:r>
@@ -178,7 +161,6 @@
           <w:rFonts w:ascii="Computer modern" w:hAnsi="Computer modern"/>
           <w:sz w:val="26"/>
           <w:szCs w:val="28"/>
-          <w:lang/>
         </w:rPr>
         <w:t>The method is</w:t>
       </w:r>
@@ -187,7 +169,6 @@
           <w:rFonts w:ascii="Computer modern" w:hAnsi="Computer modern"/>
           <w:sz w:val="26"/>
           <w:szCs w:val="28"/>
-          <w:lang/>
         </w:rPr>
         <w:t xml:space="preserve"> </w:t>
       </w:r>
@@ -196,7 +177,6 @@
           <w:rFonts w:ascii="Computer modern" w:hAnsi="Computer modern"/>
           <w:sz w:val="26"/>
           <w:szCs w:val="28"/>
-          <w:lang/>
         </w:rPr>
         <w:t>based on adaptive estimates of lower-order moments of the gradients</w:t>
       </w:r>
@@ -205,7 +185,6 @@
           <w:rFonts w:ascii="Computer modern" w:hAnsi="Computer modern"/>
           <w:sz w:val="26"/>
           <w:szCs w:val="28"/>
-          <w:lang/>
         </w:rPr>
         <w:t xml:space="preserve">. </w:t>
       </w:r>
@@ -214,7 +193,6 @@
           <w:rFonts w:ascii="Computer modern" w:hAnsi="Computer modern"/>
           <w:sz w:val="26"/>
           <w:szCs w:val="28"/>
-          <w:lang/>
         </w:rPr>
         <w:t>The method computes individual adaptive learning rates for</w:t>
       </w:r>
@@ -223,7 +201,6 @@
           <w:rFonts w:ascii="Computer modern" w:hAnsi="Computer modern"/>
           <w:sz w:val="26"/>
           <w:szCs w:val="28"/>
-          <w:lang/>
         </w:rPr>
         <w:t xml:space="preserve"> </w:t>
       </w:r>
@@ -232,7 +209,6 @@
           <w:rFonts w:ascii="Computer modern" w:hAnsi="Computer modern"/>
           <w:sz w:val="26"/>
           <w:szCs w:val="28"/>
-          <w:lang/>
         </w:rPr>
         <w:t>different parameters from estimates of first</w:t>
       </w:r>
@@ -241,7 +217,6 @@
           <w:rFonts w:ascii="Computer modern" w:hAnsi="Computer modern"/>
           <w:sz w:val="26"/>
           <w:szCs w:val="28"/>
-          <w:lang/>
         </w:rPr>
         <w:t xml:space="preserve"> (</w:t>
       </w:r>
@@ -250,7 +225,6 @@
           <w:rFonts w:ascii="Computer modern" w:hAnsi="Computer modern"/>
           <w:sz w:val="26"/>
           <w:szCs w:val="28"/>
-          <w:lang/>
         </w:rPr>
         <w:t>the mean</w:t>
       </w:r>
@@ -259,7 +233,6 @@
           <w:rFonts w:ascii="Computer modern" w:hAnsi="Computer modern"/>
           <w:sz w:val="26"/>
           <w:szCs w:val="28"/>
-          <w:lang/>
         </w:rPr>
         <w:t>)</w:t>
       </w:r>
@@ -268,7 +241,6 @@
           <w:rFonts w:ascii="Computer modern" w:hAnsi="Computer modern"/>
           <w:sz w:val="26"/>
           <w:szCs w:val="28"/>
-          <w:lang/>
         </w:rPr>
         <w:t xml:space="preserve"> and second</w:t>
       </w:r>
@@ -277,7 +249,6 @@
           <w:rFonts w:ascii="Computer modern" w:hAnsi="Computer modern"/>
           <w:sz w:val="26"/>
           <w:szCs w:val="28"/>
-          <w:lang/>
         </w:rPr>
         <w:t xml:space="preserve"> (</w:t>
       </w:r>
@@ -286,7 +257,6 @@
           <w:rFonts w:ascii="Computer modern" w:hAnsi="Computer modern"/>
           <w:sz w:val="26"/>
           <w:szCs w:val="28"/>
-          <w:lang/>
         </w:rPr>
         <w:t>the uncentered variance)</w:t>
       </w:r>
@@ -295,7 +265,6 @@
           <w:rFonts w:ascii="Computer modern" w:hAnsi="Computer modern"/>
           <w:sz w:val="26"/>
           <w:szCs w:val="28"/>
-          <w:lang/>
         </w:rPr>
         <w:t xml:space="preserve"> moments of the gradients</w:t>
       </w:r>
@@ -304,7 +273,6 @@
           <w:rFonts w:ascii="Computer modern" w:hAnsi="Computer modern"/>
           <w:sz w:val="26"/>
           <w:szCs w:val="28"/>
-          <w:lang/>
         </w:rPr>
         <w:t>.</w:t>
       </w:r>
@@ -319,7 +287,6 @@
           <w:rFonts w:ascii="Computer modern" w:hAnsi="Computer modern"/>
           <w:sz w:val="26"/>
           <w:szCs w:val="28"/>
-          <w:lang/>
         </w:rPr>
       </w:pPr>
       <w:r>
@@ -343,7 +310,6 @@
           <w:rFonts w:ascii="Computer modern" w:hAnsi="Computer modern"/>
           <w:sz w:val="26"/>
           <w:szCs w:val="28"/>
-          <w:lang/>
         </w:rPr>
         <w:t>combine</w:t>
       </w:r>
@@ -360,7 +326,6 @@
           <w:rFonts w:ascii="Computer modern" w:hAnsi="Computer modern"/>
           <w:sz w:val="26"/>
           <w:szCs w:val="28"/>
-          <w:lang/>
         </w:rPr>
         <w:t xml:space="preserve"> the advantages</w:t>
       </w:r>
@@ -369,7 +334,6 @@
           <w:rFonts w:ascii="Computer modern" w:hAnsi="Computer modern"/>
           <w:sz w:val="26"/>
           <w:szCs w:val="28"/>
-          <w:lang/>
         </w:rPr>
         <w:t xml:space="preserve"> </w:t>
       </w:r>
@@ -378,7 +342,6 @@
           <w:rFonts w:ascii="Computer modern" w:hAnsi="Computer modern"/>
           <w:sz w:val="26"/>
           <w:szCs w:val="28"/>
-          <w:lang/>
         </w:rPr>
         <w:t xml:space="preserve">of two </w:t>
       </w:r>
@@ -395,26 +358,25 @@
           <w:rFonts w:ascii="Computer modern" w:hAnsi="Computer modern"/>
           <w:sz w:val="26"/>
           <w:szCs w:val="28"/>
-          <w:lang/>
         </w:rPr>
         <w:t xml:space="preserve"> popular methods: </w:t>
       </w:r>
+      <w:proofErr w:type="spellStart"/>
       <w:r>
         <w:rPr>
           <w:rFonts w:ascii="Computer modern" w:hAnsi="Computer modern"/>
           <w:sz w:val="26"/>
           <w:szCs w:val="28"/>
           <w:highlight w:val="yellow"/>
-          <w:lang/>
         </w:rPr>
         <w:t>AdaGrad</w:t>
       </w:r>
-      <w:r>
-        <w:rPr>
-          <w:rFonts w:ascii="Computer modern" w:hAnsi="Computer modern"/>
-          <w:sz w:val="26"/>
-          <w:szCs w:val="28"/>
-          <w:lang/>
+      <w:proofErr w:type="spellEnd"/>
+      <w:r>
+        <w:rPr>
+          <w:rFonts w:ascii="Computer modern" w:hAnsi="Computer modern"/>
+          <w:sz w:val="26"/>
+          <w:szCs w:val="28"/>
         </w:rPr>
         <w:t xml:space="preserve">, </w:t>
       </w:r>
@@ -423,7 +385,6 @@
           <w:rFonts w:ascii="Computer modern" w:hAnsi="Computer modern"/>
           <w:sz w:val="26"/>
           <w:szCs w:val="28"/>
-          <w:lang/>
         </w:rPr>
         <w:t>which works well with sparse gradients</w:t>
       </w:r>
@@ -456,26 +417,25 @@
           <w:rFonts w:ascii="Computer modern" w:hAnsi="Computer modern"/>
           <w:sz w:val="26"/>
           <w:szCs w:val="28"/>
-          <w:lang/>
         </w:rPr>
         <w:t xml:space="preserve">and </w:t>
       </w:r>
+      <w:proofErr w:type="spellStart"/>
       <w:r>
         <w:rPr>
           <w:rFonts w:ascii="Computer modern" w:hAnsi="Computer modern"/>
           <w:sz w:val="26"/>
           <w:szCs w:val="28"/>
           <w:highlight w:val="yellow"/>
-          <w:lang/>
         </w:rPr>
         <w:t>RMSProp</w:t>
       </w:r>
-      <w:r>
-        <w:rPr>
-          <w:rFonts w:ascii="Computer modern" w:hAnsi="Computer modern"/>
-          <w:sz w:val="26"/>
-          <w:szCs w:val="28"/>
-          <w:lang/>
+      <w:proofErr w:type="spellEnd"/>
+      <w:r>
+        <w:rPr>
+          <w:rFonts w:ascii="Computer modern" w:hAnsi="Computer modern"/>
+          <w:sz w:val="26"/>
+          <w:szCs w:val="28"/>
         </w:rPr>
         <w:t xml:space="preserve">, </w:t>
       </w:r>
@@ -484,7 +444,6 @@
           <w:rFonts w:ascii="Computer modern" w:hAnsi="Computer modern"/>
           <w:sz w:val="26"/>
           <w:szCs w:val="28"/>
-          <w:lang/>
         </w:rPr>
         <w:t>which</w:t>
       </w:r>
@@ -517,7 +476,6 @@
           <w:rFonts w:ascii="Computer modern" w:hAnsi="Computer modern"/>
           <w:sz w:val="26"/>
           <w:szCs w:val="28"/>
-          <w:lang/>
         </w:rPr>
         <w:t xml:space="preserve"> works well in on-line and non-stationary</w:t>
       </w:r>
@@ -526,7 +484,6 @@
           <w:rFonts w:ascii="Computer modern" w:hAnsi="Computer modern"/>
           <w:sz w:val="26"/>
           <w:szCs w:val="28"/>
-          <w:lang/>
         </w:rPr>
         <w:t xml:space="preserve"> </w:t>
       </w:r>
@@ -535,7 +492,6 @@
           <w:rFonts w:ascii="Computer modern" w:hAnsi="Computer modern"/>
           <w:sz w:val="26"/>
           <w:szCs w:val="28"/>
-          <w:lang/>
         </w:rPr>
         <w:t>settings</w:t>
       </w:r>
@@ -544,7 +500,6 @@
           <w:rFonts w:ascii="Computer modern" w:hAnsi="Computer modern"/>
           <w:sz w:val="26"/>
           <w:szCs w:val="28"/>
-          <w:lang/>
         </w:rPr>
         <w:t>.</w:t>
       </w:r>
@@ -556,15 +511,13 @@
           <w:rFonts w:ascii="Computer modern" w:hAnsi="Computer modern"/>
           <w:sz w:val="26"/>
           <w:szCs w:val="28"/>
-          <w:lang/>
-        </w:rPr>
-      </w:pPr>
-      <w:r>
-        <w:rPr>
-          <w:rFonts w:ascii="Computer modern" w:hAnsi="Computer modern"/>
-          <w:sz w:val="26"/>
-          <w:szCs w:val="28"/>
-          <w:lang/>
+        </w:rPr>
+      </w:pPr>
+      <w:r>
+        <w:rPr>
+          <w:rFonts w:ascii="Computer modern" w:hAnsi="Computer modern"/>
+          <w:sz w:val="26"/>
+          <w:szCs w:val="28"/>
         </w:rPr>
         <w:t>Algorithm</w:t>
       </w:r>
@@ -573,7 +526,6 @@
           <w:rFonts w:ascii="Computer modern" w:hAnsi="Computer modern"/>
           <w:sz w:val="26"/>
           <w:szCs w:val="28"/>
-          <w:lang/>
         </w:rPr>
         <w:t xml:space="preserve"> of implementation Adam optimizer</w:t>
       </w:r>
@@ -582,7 +534,6 @@
           <w:rFonts w:ascii="Computer modern" w:hAnsi="Computer modern"/>
           <w:sz w:val="26"/>
           <w:szCs w:val="28"/>
-          <w:lang/>
         </w:rPr>
         <w:t>.</w:t>
       </w:r>
@@ -594,15 +545,13 @@
           <w:rFonts w:ascii="Computer modern" w:hAnsi="Computer modern"/>
           <w:sz w:val="26"/>
           <w:szCs w:val="28"/>
-          <w:lang/>
-        </w:rPr>
-      </w:pPr>
-      <w:r>
-        <w:rPr>
-          <w:rFonts w:ascii="Computer modern" w:hAnsi="Computer modern"/>
-          <w:sz w:val="26"/>
-          <w:szCs w:val="28"/>
-          <w:lang/>
+        </w:rPr>
+      </w:pPr>
+      <w:r>
+        <w:rPr>
+          <w:rFonts w:ascii="Computer modern" w:hAnsi="Computer modern"/>
+          <w:sz w:val="26"/>
+          <w:szCs w:val="28"/>
         </w:rPr>
         <w:t>Initializ</w:t>
       </w:r>
@@ -611,7 +560,6 @@
           <w:rFonts w:ascii="Computer modern" w:hAnsi="Computer modern"/>
           <w:sz w:val="26"/>
           <w:szCs w:val="28"/>
-          <w:lang/>
         </w:rPr>
         <w:t>ation of</w:t>
       </w:r>
@@ -620,7 +568,6 @@
           <w:rFonts w:ascii="Computer modern" w:hAnsi="Computer modern"/>
           <w:sz w:val="26"/>
           <w:szCs w:val="28"/>
-          <w:lang/>
         </w:rPr>
         <w:t xml:space="preserve"> default values</w:t>
       </w:r>
@@ -629,7 +576,6 @@
           <w:rFonts w:ascii="Computer modern" w:hAnsi="Computer modern"/>
           <w:sz w:val="26"/>
           <w:szCs w:val="28"/>
-          <w:lang/>
         </w:rPr>
         <w:t xml:space="preserve"> for the tested machine learning problems</w:t>
       </w:r>
@@ -638,7 +584,6 @@
           <w:rFonts w:ascii="Computer modern" w:hAnsi="Computer modern"/>
           <w:sz w:val="26"/>
           <w:szCs w:val="28"/>
-          <w:lang/>
         </w:rPr>
         <w:t>.</w:t>
       </w:r>
@@ -650,24 +595,31 @@
           <w:rFonts w:ascii="Computer modern" w:eastAsiaTheme="minorEastAsia" w:hAnsi="Computer modern"/>
           <w:sz w:val="26"/>
           <w:szCs w:val="28"/>
-          <w:lang/>
-        </w:rPr>
-      </w:pPr>
-      <w:r>
-        <w:rPr>
-          <w:rFonts w:ascii="Computer modern" w:hAnsi="Computer modern"/>
-          <w:sz w:val="26"/>
-          <w:szCs w:val="28"/>
-          <w:lang/>
-        </w:rPr>
-        <w:t>Stepsize:</w:t>
-      </w:r>
-      <w:r>
-        <w:rPr>
-          <w:rFonts w:ascii="Computer modern" w:hAnsi="Computer modern"/>
-          <w:sz w:val="26"/>
-          <w:szCs w:val="28"/>
-          <w:lang/>
+        </w:rPr>
+      </w:pPr>
+      <w:proofErr w:type="spellStart"/>
+      <w:r>
+        <w:rPr>
+          <w:rFonts w:ascii="Computer modern" w:hAnsi="Computer modern"/>
+          <w:sz w:val="26"/>
+          <w:szCs w:val="28"/>
+        </w:rPr>
+        <w:t>Stepsize</w:t>
+      </w:r>
+      <w:proofErr w:type="spellEnd"/>
+      <w:r>
+        <w:rPr>
+          <w:rFonts w:ascii="Computer modern" w:hAnsi="Computer modern"/>
+          <w:sz w:val="26"/>
+          <w:szCs w:val="28"/>
+        </w:rPr>
+        <w:t>:</w:t>
+      </w:r>
+      <w:r>
+        <w:rPr>
+          <w:rFonts w:ascii="Computer modern" w:hAnsi="Computer modern"/>
+          <w:sz w:val="26"/>
+          <w:szCs w:val="28"/>
         </w:rPr>
         <w:t xml:space="preserve"> </w:t>
       </w:r>
@@ -677,7 +629,6 @@
             <w:rFonts w:ascii="Cambria Math" w:hAnsi="Cambria Math"/>
             <w:sz w:val="26"/>
             <w:szCs w:val="28"/>
-            <w:lang/>
           </w:rPr>
           <m:t>α = 0.001</m:t>
         </m:r>
@@ -687,7 +638,6 @@
           <w:rFonts w:ascii="Computer modern" w:eastAsiaTheme="minorEastAsia" w:hAnsi="Computer modern"/>
           <w:sz w:val="26"/>
           <w:szCs w:val="28"/>
-          <w:lang/>
         </w:rPr>
         <w:t xml:space="preserve">, </w:t>
       </w:r>
@@ -699,15 +649,13 @@
           <w:rFonts w:ascii="Computer modern" w:eastAsiaTheme="minorEastAsia" w:hAnsi="Computer modern"/>
           <w:sz w:val="26"/>
           <w:szCs w:val="28"/>
-          <w:lang/>
-        </w:rPr>
-      </w:pPr>
-      <w:r>
-        <w:rPr>
-          <w:rFonts w:ascii="Computer modern" w:hAnsi="Computer modern"/>
-          <w:sz w:val="26"/>
-          <w:szCs w:val="28"/>
-          <w:lang/>
+        </w:rPr>
+      </w:pPr>
+      <w:r>
+        <w:rPr>
+          <w:rFonts w:ascii="Computer modern" w:hAnsi="Computer modern"/>
+          <w:sz w:val="26"/>
+          <w:szCs w:val="28"/>
         </w:rPr>
         <w:t>Exponential decay rates</w:t>
       </w:r>
@@ -716,7 +664,6 @@
           <w:rFonts w:ascii="Computer modern" w:hAnsi="Computer modern"/>
           <w:sz w:val="26"/>
           <w:szCs w:val="28"/>
-          <w:lang/>
         </w:rPr>
         <w:t>:</w:t>
       </w:r>
@@ -725,7 +672,6 @@
           <w:rFonts w:ascii="Computer modern" w:hAnsi="Computer modern"/>
           <w:sz w:val="26"/>
           <w:szCs w:val="28"/>
-          <w:lang/>
         </w:rPr>
         <w:t xml:space="preserve"> </w:t>
       </w:r>
@@ -738,7 +684,6 @@
             <w:rFonts w:ascii="Cambria Math" w:hAnsi="Cambria Math"/>
             <w:sz w:val="26"/>
             <w:szCs w:val="28"/>
-            <w:lang/>
           </w:rPr>
           <m:t>β1 = 0.9, β2 = 0.999</m:t>
         </m:r>
@@ -750,7 +695,6 @@
             <w:rFonts w:ascii="Cambria Math" w:eastAsiaTheme="minorEastAsia" w:hAnsi="Cambria Math"/>
             <w:sz w:val="26"/>
             <w:szCs w:val="28"/>
-            <w:lang/>
           </w:rPr>
           <m:t xml:space="preserve">∈ </m:t>
         </m:r>
@@ -762,7 +706,6 @@
                 <w:rFonts w:ascii="Cambria Math" w:eastAsiaTheme="minorEastAsia" w:hAnsi="Cambria Math"/>
                 <w:sz w:val="26"/>
                 <w:szCs w:val="28"/>
-                <w:lang/>
               </w:rPr>
             </m:ctrlPr>
           </m:dPr>
@@ -775,7 +718,6 @@
                 <w:rFonts w:ascii="Cambria Math" w:eastAsiaTheme="minorEastAsia" w:hAnsi="Cambria Math"/>
                 <w:sz w:val="26"/>
                 <w:szCs w:val="28"/>
-                <w:lang/>
               </w:rPr>
               <m:t>0, 1</m:t>
             </m:r>
@@ -789,7 +731,6 @@
             <w:rFonts w:ascii="Cambria Math" w:eastAsiaTheme="minorEastAsia" w:hAnsi="Cambria Math"/>
             <w:sz w:val="26"/>
             <w:szCs w:val="28"/>
-            <w:lang/>
           </w:rPr>
           <m:t>,</m:t>
         </m:r>
@@ -801,7 +742,6 @@
             <w:rFonts w:ascii="Cambria Math" w:hAnsi="Cambria Math"/>
             <w:sz w:val="26"/>
             <w:szCs w:val="28"/>
-            <w:lang/>
           </w:rPr>
           <m:t xml:space="preserve"> λ= 1-</m:t>
         </m:r>
@@ -812,7 +752,6 @@
                 <w:rFonts w:ascii="Cambria Math" w:hAnsi="Cambria Math"/>
                 <w:sz w:val="26"/>
                 <w:szCs w:val="28"/>
-                <w:lang/>
               </w:rPr>
             </m:ctrlPr>
           </m:sSupPr>
@@ -822,7 +761,6 @@
                 <w:rFonts w:ascii="Cambria Math" w:hAnsi="Cambria Math"/>
                 <w:sz w:val="26"/>
                 <w:szCs w:val="28"/>
-                <w:lang/>
               </w:rPr>
               <m:t>10</m:t>
             </m:r>
@@ -833,7 +771,6 @@
                 <w:rFonts w:ascii="Cambria Math" w:hAnsi="Cambria Math"/>
                 <w:sz w:val="26"/>
                 <w:szCs w:val="28"/>
-                <w:lang/>
               </w:rPr>
               <m:t>-8</m:t>
             </m:r>
@@ -844,7 +781,6 @@
             <w:rFonts w:ascii="Cambria Math" w:hAnsi="Cambria Math"/>
             <w:sz w:val="26"/>
             <w:szCs w:val="28"/>
-            <w:lang/>
           </w:rPr>
           <m:t xml:space="preserve">∈ [0, 1] </m:t>
         </m:r>
@@ -972,7 +908,6 @@
             <w:rFonts w:ascii="Cambria Math" w:hAnsi="Cambria Math"/>
             <w:sz w:val="26"/>
             <w:szCs w:val="28"/>
-            <w:lang/>
           </w:rPr>
           <m:t>=</m:t>
         </m:r>
@@ -983,7 +918,6 @@
                 <w:rFonts w:ascii="Cambria Math" w:hAnsi="Cambria Math"/>
                 <w:sz w:val="26"/>
                 <w:szCs w:val="28"/>
-                <w:lang/>
               </w:rPr>
             </m:ctrlPr>
           </m:sSupPr>
@@ -993,7 +927,6 @@
                 <w:rFonts w:ascii="Cambria Math" w:hAnsi="Cambria Math"/>
                 <w:sz w:val="26"/>
                 <w:szCs w:val="28"/>
-                <w:lang/>
               </w:rPr>
               <m:t>10</m:t>
             </m:r>
@@ -1004,7 +937,6 @@
                 <w:rFonts w:ascii="Cambria Math" w:hAnsi="Cambria Math"/>
                 <w:sz w:val="26"/>
                 <w:szCs w:val="28"/>
-                <w:lang/>
               </w:rPr>
               <m:t>-8</m:t>
             </m:r>
@@ -1027,15 +959,13 @@
           <w:rFonts w:ascii="Computer modern" w:eastAsiaTheme="minorEastAsia" w:hAnsi="Computer modern"/>
           <w:sz w:val="26"/>
           <w:szCs w:val="28"/>
-          <w:lang/>
-        </w:rPr>
-      </w:pPr>
-      <w:r>
-        <w:rPr>
-          <w:rFonts w:ascii="Computer modern" w:hAnsi="Computer modern"/>
-          <w:sz w:val="26"/>
-          <w:szCs w:val="28"/>
-          <w:lang/>
+        </w:rPr>
+      </w:pPr>
+      <w:r>
+        <w:rPr>
+          <w:rFonts w:ascii="Computer modern" w:hAnsi="Computer modern"/>
+          <w:sz w:val="26"/>
+          <w:szCs w:val="28"/>
         </w:rPr>
         <w:t xml:space="preserve">First moment vector </w:t>
       </w:r>
@@ -1048,7 +978,6 @@
                 <w:i/>
                 <w:sz w:val="26"/>
                 <w:szCs w:val="28"/>
-                <w:lang/>
               </w:rPr>
             </m:ctrlPr>
           </m:sSubPr>
@@ -1058,7 +987,6 @@
                 <w:rFonts w:ascii="Cambria Math" w:hAnsi="Cambria Math"/>
                 <w:sz w:val="26"/>
                 <w:szCs w:val="28"/>
-                <w:lang/>
               </w:rPr>
               <m:t>m</m:t>
             </m:r>
@@ -1069,7 +997,6 @@
                 <w:rFonts w:ascii="Cambria Math" w:hAnsi="Cambria Math"/>
                 <w:sz w:val="26"/>
                 <w:szCs w:val="28"/>
-                <w:lang/>
               </w:rPr>
               <m:t>0</m:t>
             </m:r>
@@ -1080,7 +1007,6 @@
             <w:rFonts w:ascii="Cambria Math" w:hAnsi="Cambria Math"/>
             <w:sz w:val="26"/>
             <w:szCs w:val="28"/>
-            <w:lang/>
           </w:rPr>
           <m:t xml:space="preserve"> = </m:t>
         </m:r>
@@ -1092,7 +1018,6 @@
                 <w:i/>
                 <w:sz w:val="26"/>
                 <w:szCs w:val="28"/>
-                <w:lang/>
               </w:rPr>
             </m:ctrlPr>
           </m:sSupPr>
@@ -1102,7 +1027,6 @@
                 <w:rFonts w:ascii="Cambria Math" w:hAnsi="Cambria Math"/>
                 <w:sz w:val="26"/>
                 <w:szCs w:val="28"/>
-                <w:lang/>
               </w:rPr>
               <m:t>[0,0,…0]</m:t>
             </m:r>
@@ -1113,7 +1037,6 @@
                 <w:rFonts w:ascii="Cambria Math" w:hAnsi="Cambria Math"/>
                 <w:sz w:val="26"/>
                 <w:szCs w:val="28"/>
-                <w:lang/>
               </w:rPr>
               <m:t>T</m:t>
             </m:r>
@@ -1127,7 +1050,6 @@
             <w:rFonts w:ascii="Cambria Math" w:eastAsiaTheme="minorEastAsia" w:hAnsi="Cambria Math"/>
             <w:sz w:val="26"/>
             <w:szCs w:val="28"/>
-            <w:lang/>
           </w:rPr>
           <m:t>∈</m:t>
         </m:r>
@@ -1138,7 +1060,6 @@
                 <w:rFonts w:ascii="Cambria Math" w:eastAsiaTheme="minorEastAsia" w:hAnsi="Cambria Math"/>
                 <w:sz w:val="26"/>
                 <w:szCs w:val="28"/>
-                <w:lang/>
               </w:rPr>
             </m:ctrlPr>
           </m:sSupPr>
@@ -1151,7 +1072,6 @@
                 <w:rFonts w:ascii="Cambria Math" w:eastAsiaTheme="minorEastAsia" w:hAnsi="Cambria Math"/>
                 <w:sz w:val="26"/>
                 <w:szCs w:val="28"/>
-                <w:lang/>
               </w:rPr>
               <m:t>R</m:t>
             </m:r>
@@ -1162,7 +1082,6 @@
                 <w:rFonts w:ascii="Cambria Math" w:eastAsiaTheme="minorEastAsia" w:hAnsi="Cambria Math"/>
                 <w:sz w:val="26"/>
                 <w:szCs w:val="28"/>
-                <w:lang/>
               </w:rPr>
               <m:t>n</m:t>
             </m:r>
@@ -1177,15 +1096,13 @@
           <w:rFonts w:ascii="Computer modern" w:eastAsiaTheme="minorEastAsia" w:hAnsi="Computer modern"/>
           <w:sz w:val="26"/>
           <w:szCs w:val="28"/>
-          <w:lang/>
-        </w:rPr>
-      </w:pPr>
-      <w:r>
-        <w:rPr>
-          <w:rFonts w:ascii="Computer modern" w:hAnsi="Computer modern"/>
-          <w:sz w:val="26"/>
-          <w:szCs w:val="28"/>
-          <w:lang/>
+        </w:rPr>
+      </w:pPr>
+      <w:r>
+        <w:rPr>
+          <w:rFonts w:ascii="Computer modern" w:hAnsi="Computer modern"/>
+          <w:sz w:val="26"/>
+          <w:szCs w:val="28"/>
         </w:rPr>
         <w:t xml:space="preserve">Second moment vector </w:t>
       </w:r>
@@ -1198,7 +1115,6 @@
                 <w:i/>
                 <w:sz w:val="26"/>
                 <w:szCs w:val="28"/>
-                <w:lang/>
               </w:rPr>
             </m:ctrlPr>
           </m:sSubPr>
@@ -1208,7 +1124,6 @@
                 <w:rFonts w:ascii="Cambria Math" w:hAnsi="Cambria Math"/>
                 <w:sz w:val="26"/>
                 <w:szCs w:val="28"/>
-                <w:lang/>
               </w:rPr>
               <m:t>v</m:t>
             </m:r>
@@ -1219,7 +1134,6 @@
                 <w:rFonts w:ascii="Cambria Math" w:hAnsi="Cambria Math"/>
                 <w:sz w:val="26"/>
                 <w:szCs w:val="28"/>
-                <w:lang/>
               </w:rPr>
               <m:t>0</m:t>
             </m:r>
@@ -1230,7 +1144,6 @@
             <w:rFonts w:ascii="Cambria Math" w:hAnsi="Cambria Math"/>
             <w:sz w:val="26"/>
             <w:szCs w:val="28"/>
-            <w:lang/>
           </w:rPr>
           <m:t xml:space="preserve"> =</m:t>
         </m:r>
@@ -1242,7 +1155,6 @@
                 <w:i/>
                 <w:sz w:val="26"/>
                 <w:szCs w:val="28"/>
-                <w:lang/>
               </w:rPr>
             </m:ctrlPr>
           </m:sSupPr>
@@ -1252,7 +1164,6 @@
                 <w:rFonts w:ascii="Cambria Math" w:hAnsi="Cambria Math"/>
                 <w:sz w:val="26"/>
                 <w:szCs w:val="28"/>
-                <w:lang/>
               </w:rPr>
               <m:t>[0,0,…0]</m:t>
             </m:r>
@@ -1263,7 +1174,6 @@
                 <w:rFonts w:ascii="Cambria Math" w:hAnsi="Cambria Math"/>
                 <w:sz w:val="26"/>
                 <w:szCs w:val="28"/>
-                <w:lang/>
               </w:rPr>
               <m:t>T</m:t>
             </m:r>
@@ -1277,7 +1187,6 @@
             <w:rFonts w:ascii="Cambria Math" w:eastAsiaTheme="minorEastAsia" w:hAnsi="Cambria Math"/>
             <w:sz w:val="26"/>
             <w:szCs w:val="28"/>
-            <w:lang/>
           </w:rPr>
           <m:t>∈</m:t>
         </m:r>
@@ -1288,7 +1197,6 @@
                 <w:rFonts w:ascii="Cambria Math" w:eastAsiaTheme="minorEastAsia" w:hAnsi="Cambria Math"/>
                 <w:sz w:val="26"/>
                 <w:szCs w:val="28"/>
-                <w:lang/>
               </w:rPr>
             </m:ctrlPr>
           </m:sSupPr>
@@ -1301,7 +1209,6 @@
                 <w:rFonts w:ascii="Cambria Math" w:eastAsiaTheme="minorEastAsia" w:hAnsi="Cambria Math"/>
                 <w:sz w:val="26"/>
                 <w:szCs w:val="28"/>
-                <w:lang/>
               </w:rPr>
               <m:t>R</m:t>
             </m:r>
@@ -1312,7 +1219,6 @@
                 <w:rFonts w:ascii="Cambria Math" w:eastAsiaTheme="minorEastAsia" w:hAnsi="Cambria Math"/>
                 <w:sz w:val="26"/>
                 <w:szCs w:val="28"/>
-                <w:lang/>
               </w:rPr>
               <m:t>n</m:t>
             </m:r>
@@ -1327,15 +1233,13 @@
           <w:rFonts w:ascii="Computer modern" w:eastAsiaTheme="minorEastAsia" w:hAnsi="Computer modern"/>
           <w:sz w:val="26"/>
           <w:szCs w:val="28"/>
-          <w:lang/>
-        </w:rPr>
-      </w:pPr>
-      <w:r>
-        <w:rPr>
-          <w:rFonts w:ascii="Computer modern" w:hAnsi="Computer modern"/>
-          <w:sz w:val="26"/>
-          <w:szCs w:val="28"/>
-          <w:lang/>
+        </w:rPr>
+      </w:pPr>
+      <w:r>
+        <w:rPr>
+          <w:rFonts w:ascii="Computer modern" w:hAnsi="Computer modern"/>
+          <w:sz w:val="26"/>
+          <w:szCs w:val="28"/>
         </w:rPr>
         <w:t xml:space="preserve">Timestep </w:t>
       </w:r>
@@ -1345,7 +1249,6 @@
             <w:rFonts w:ascii="Cambria Math" w:hAnsi="Cambria Math"/>
             <w:sz w:val="26"/>
             <w:szCs w:val="28"/>
-            <w:lang/>
           </w:rPr>
           <m:t>t = 0</m:t>
         </m:r>
@@ -1355,7 +1258,6 @@
           <w:rFonts w:ascii="Computer modern" w:eastAsiaTheme="minorEastAsia" w:hAnsi="Computer modern"/>
           <w:sz w:val="26"/>
           <w:szCs w:val="28"/>
-          <w:lang/>
         </w:rPr>
         <w:t>,</w:t>
       </w:r>
@@ -1367,7 +1269,6 @@
           <w:rFonts w:ascii="Computer modern" w:eastAsiaTheme="minorEastAsia" w:hAnsi="Computer modern"/>
           <w:sz w:val="26"/>
           <w:szCs w:val="28"/>
-          <w:lang/>
         </w:rPr>
       </w:pPr>
       <w:r>
@@ -1375,7 +1276,6 @@
           <w:rFonts w:ascii="Computer modern" w:eastAsiaTheme="minorEastAsia" w:hAnsi="Computer modern"/>
           <w:sz w:val="26"/>
           <w:szCs w:val="28"/>
-          <w:lang/>
         </w:rPr>
         <w:t>Initial parameter vector</w:t>
       </w:r>
@@ -1384,7 +1284,6 @@
           <w:rFonts w:ascii="Computer modern" w:eastAsiaTheme="minorEastAsia" w:hAnsi="Computer modern"/>
           <w:sz w:val="26"/>
           <w:szCs w:val="28"/>
-          <w:lang/>
         </w:rPr>
         <w:t xml:space="preserve"> </w:t>
       </w:r>
@@ -1409,7 +1308,6 @@
                 <w:rFonts w:ascii="Cambria Math" w:hAnsi="Cambria Math"/>
                 <w:sz w:val="26"/>
                 <w:szCs w:val="28"/>
-                <w:lang/>
               </w:rPr>
               <m:t>θ</m:t>
             </m:r>
@@ -1433,7 +1331,6 @@
             <w:rFonts w:ascii="Cambria Math" w:eastAsiaTheme="minorEastAsia" w:hAnsi="Cambria Math"/>
             <w:sz w:val="26"/>
             <w:szCs w:val="28"/>
-            <w:lang/>
           </w:rPr>
           <m:t>∈</m:t>
         </m:r>
@@ -1444,7 +1341,6 @@
                 <w:rFonts w:ascii="Cambria Math" w:eastAsiaTheme="minorEastAsia" w:hAnsi="Cambria Math"/>
                 <w:sz w:val="26"/>
                 <w:szCs w:val="28"/>
-                <w:lang/>
               </w:rPr>
             </m:ctrlPr>
           </m:sSupPr>
@@ -1457,7 +1353,6 @@
                 <w:rFonts w:ascii="Cambria Math" w:eastAsiaTheme="minorEastAsia" w:hAnsi="Cambria Math"/>
                 <w:sz w:val="26"/>
                 <w:szCs w:val="28"/>
-                <w:lang/>
               </w:rPr>
               <m:t>R</m:t>
             </m:r>
@@ -1468,7 +1363,6 @@
                 <w:rFonts w:ascii="Cambria Math" w:eastAsiaTheme="minorEastAsia" w:hAnsi="Cambria Math"/>
                 <w:sz w:val="26"/>
                 <w:szCs w:val="28"/>
-                <w:lang/>
               </w:rPr>
               <m:t>n</m:t>
             </m:r>
@@ -1492,7 +1386,6 @@
           <w:rFonts w:ascii="Computer modern" w:eastAsiaTheme="minorEastAsia" w:hAnsi="Computer modern"/>
           <w:sz w:val="26"/>
           <w:szCs w:val="28"/>
-          <w:lang/>
         </w:rPr>
       </w:pPr>
       <w:r>
@@ -1500,18 +1393,8 @@
           <w:rFonts w:ascii="Computer modern" w:eastAsiaTheme="minorEastAsia" w:hAnsi="Computer modern"/>
           <w:sz w:val="26"/>
           <w:szCs w:val="28"/>
-          <w:lang/>
         </w:rPr>
         <w:t>Runing the loop till the convergence</w:t>
-      </w:r>
-      <w:r>
-        <w:rPr>
-          <w:rFonts w:ascii="Computer modern" w:eastAsiaTheme="minorEastAsia" w:hAnsi="Computer modern"/>
-          <w:sz w:val="26"/>
-          <w:szCs w:val="28"/>
-          <w:lang/>
-        </w:rPr>
-        <w:t>,</w:t>
       </w:r>
     </w:p>
     <w:p>
@@ -1528,7 +1411,6 @@
           <w:rFonts w:ascii="Computer modern" w:eastAsiaTheme="minorEastAsia" w:hAnsi="Computer modern"/>
           <w:sz w:val="26"/>
           <w:szCs w:val="28"/>
-          <w:lang/>
         </w:rPr>
         <w:t xml:space="preserve">while </w:t>
       </w:r>
@@ -1541,7 +1423,6 @@
             <w:rFonts w:ascii="Cambria Math" w:eastAsiaTheme="minorEastAsia" w:hAnsi="Cambria Math"/>
             <w:sz w:val="26"/>
             <w:szCs w:val="28"/>
-            <w:lang/>
           </w:rPr>
           <m:t>||</m:t>
         </m:r>
@@ -1553,7 +1434,6 @@
             <w:rFonts w:ascii="Cambria Math" w:hAnsi="Cambria Math"/>
             <w:sz w:val="26"/>
             <w:szCs w:val="28"/>
-            <w:lang/>
           </w:rPr>
           <m:t>∇f</m:t>
         </m:r>
@@ -1562,7 +1442,6 @@
             <w:rFonts w:ascii="Cambria Math" w:eastAsiaTheme="minorEastAsia" w:hAnsi="Cambria Math"/>
             <w:sz w:val="26"/>
             <w:szCs w:val="28"/>
-            <w:lang/>
           </w:rPr>
           <m:t xml:space="preserve"> </m:t>
         </m:r>
@@ -1586,7 +1465,6 @@
                 <w:rFonts w:ascii="Cambria Math" w:hAnsi="Cambria Math"/>
                 <w:sz w:val="26"/>
                 <w:szCs w:val="28"/>
-                <w:lang/>
               </w:rPr>
               <m:t>(θ</m:t>
             </m:r>
@@ -1610,7 +1488,6 @@
             <w:rFonts w:ascii="Cambria Math" w:eastAsiaTheme="minorEastAsia" w:hAnsi="Cambria Math"/>
             <w:sz w:val="26"/>
             <w:szCs w:val="28"/>
-            <w:lang/>
           </w:rPr>
           <m:t>)||&gt;</m:t>
         </m:r>
@@ -1619,7 +1496,6 @@
             <w:rFonts w:ascii="Cambria Math" w:eastAsiaTheme="minorEastAsia" w:hAnsi="Cambria Math"/>
             <w:sz w:val="26"/>
             <w:szCs w:val="28"/>
-            <w:lang/>
           </w:rPr>
           <m:t xml:space="preserve"> </m:t>
         </m:r>
@@ -1672,7 +1548,6 @@
           <w:rFonts w:ascii="Computer modern" w:eastAsiaTheme="minorEastAsia" w:hAnsi="Computer modern"/>
           <w:sz w:val="26"/>
           <w:szCs w:val="28"/>
-          <w:lang/>
         </w:rPr>
       </w:pPr>
       <m:oMathPara>
@@ -1682,7 +1557,6 @@
               <w:rFonts w:ascii="Cambria Math" w:hAnsi="Cambria Math"/>
               <w:sz w:val="26"/>
               <w:szCs w:val="28"/>
-              <w:lang/>
             </w:rPr>
             <m:t>t= t + 1</m:t>
           </m:r>
@@ -1881,26 +1755,15 @@
           <w:rFonts w:ascii="Computer modern" w:hAnsi="Computer modern"/>
           <w:sz w:val="26"/>
           <w:szCs w:val="28"/>
-          <w:lang/>
-        </w:rPr>
-      </w:pPr>
-      <w:r>
-        <w:rPr>
-          <w:rFonts w:ascii="Computer modern" w:hAnsi="Computer modern"/>
-          <w:sz w:val="26"/>
-          <w:szCs w:val="28"/>
-          <w:lang/>
+        </w:rPr>
+      </w:pPr>
+      <w:r>
+        <w:rPr>
+          <w:rFonts w:ascii="Computer modern" w:hAnsi="Computer modern"/>
+          <w:sz w:val="26"/>
+          <w:szCs w:val="28"/>
         </w:rPr>
         <w:t>Decay the first moment running average coefficient</w:t>
-      </w:r>
-      <w:r>
-        <w:rPr>
-          <w:rFonts w:ascii="Computer modern" w:hAnsi="Computer modern"/>
-          <w:sz w:val="26"/>
-          <w:szCs w:val="28"/>
-          <w:lang/>
-        </w:rPr>
-        <w:t>,</w:t>
       </w:r>
     </w:p>
     <w:p>
@@ -1910,7 +1773,6 @@
           <w:rFonts w:ascii="Computer modern" w:hAnsi="Computer modern"/>
           <w:sz w:val="26"/>
           <w:szCs w:val="28"/>
-          <w:lang/>
         </w:rPr>
       </w:pPr>
       <m:oMathPara>
@@ -1920,7 +1782,6 @@
               <w:rFonts w:ascii="Cambria Math" w:hAnsi="Cambria Math"/>
               <w:sz w:val="26"/>
               <w:szCs w:val="28"/>
-              <w:lang/>
             </w:rPr>
             <m:t xml:space="preserve"> </m:t>
           </m:r>
@@ -1932,7 +1793,6 @@
                   <w:i/>
                   <w:sz w:val="26"/>
                   <w:szCs w:val="28"/>
-                  <w:lang/>
                 </w:rPr>
               </m:ctrlPr>
             </m:sSubPr>
@@ -1942,7 +1802,6 @@
                   <w:rFonts w:ascii="Cambria Math" w:hAnsi="Cambria Math"/>
                   <w:sz w:val="26"/>
                   <w:szCs w:val="28"/>
-                  <w:lang/>
                 </w:rPr>
                 <m:t>β</m:t>
               </m:r>
@@ -1953,7 +1812,6 @@
                   <w:rFonts w:ascii="Cambria Math" w:hAnsi="Cambria Math"/>
                   <w:sz w:val="26"/>
                   <w:szCs w:val="28"/>
-                  <w:lang/>
                 </w:rPr>
                 <m:t>1,t</m:t>
               </m:r>
@@ -1964,7 +1822,6 @@
               <w:rFonts w:ascii="Cambria Math" w:hAnsi="Cambria Math"/>
               <w:sz w:val="26"/>
               <w:szCs w:val="28"/>
-              <w:lang/>
             </w:rPr>
             <m:t xml:space="preserve">= </m:t>
           </m:r>
@@ -1976,7 +1833,6 @@
                   <w:i/>
                   <w:sz w:val="26"/>
                   <w:szCs w:val="28"/>
-                  <w:lang/>
                 </w:rPr>
               </m:ctrlPr>
             </m:sSubPr>
@@ -1986,7 +1842,6 @@
                   <w:rFonts w:ascii="Cambria Math" w:hAnsi="Cambria Math"/>
                   <w:sz w:val="26"/>
                   <w:szCs w:val="28"/>
-                  <w:lang/>
                 </w:rPr>
                 <m:t>β</m:t>
               </m:r>
@@ -1997,7 +1852,6 @@
                   <w:rFonts w:ascii="Cambria Math" w:hAnsi="Cambria Math"/>
                   <w:sz w:val="26"/>
                   <w:szCs w:val="28"/>
-                  <w:lang/>
                 </w:rPr>
                 <m:t>1</m:t>
               </m:r>
@@ -2011,7 +1865,6 @@
                   <w:i/>
                   <w:sz w:val="26"/>
                   <w:szCs w:val="28"/>
-                  <w:lang/>
                 </w:rPr>
               </m:ctrlPr>
             </m:sSupPr>
@@ -2021,7 +1874,6 @@
                   <w:rFonts w:ascii="Cambria Math" w:hAnsi="Cambria Math"/>
                   <w:sz w:val="26"/>
                   <w:szCs w:val="28"/>
-                  <w:lang/>
                 </w:rPr>
                 <m:t>λ</m:t>
               </m:r>
@@ -2032,7 +1884,6 @@
                   <w:rFonts w:ascii="Cambria Math" w:hAnsi="Cambria Math"/>
                   <w:sz w:val="26"/>
                   <w:szCs w:val="28"/>
-                  <w:lang/>
                 </w:rPr>
                 <m:t xml:space="preserve">t-1 </m:t>
               </m:r>
@@ -2056,18 +1907,34 @@
           <w:rFonts w:ascii="Computer modern" w:hAnsi="Computer modern"/>
           <w:sz w:val="26"/>
           <w:szCs w:val="28"/>
-          <w:lang/>
-        </w:rPr>
-      </w:pPr>
-      <w:r>
-        <w:rPr>
-          <w:rFonts w:ascii="Computer modern" w:hAnsi="Computer modern"/>
-          <w:sz w:val="26"/>
-          <w:szCs w:val="28"/>
-          <w:lang/>
+        </w:rPr>
+      </w:pPr>
+      <w:r>
+        <w:rPr>
+          <w:rFonts w:ascii="Computer modern" w:hAnsi="Computer modern"/>
+          <w:sz w:val="26"/>
+          <w:szCs w:val="28"/>
         </w:rPr>
         <w:lastRenderedPageBreak/>
-        <w:t>Get gradients w.r.t. stochastic objective at timestep t,</w:t>
+        <w:t xml:space="preserve">Get gradients </w:t>
+      </w:r>
+      <w:proofErr w:type="spellStart"/>
+      <w:r>
+        <w:rPr>
+          <w:rFonts w:ascii="Computer modern" w:hAnsi="Computer modern"/>
+          <w:sz w:val="26"/>
+          <w:szCs w:val="28"/>
+        </w:rPr>
+        <w:t>w.r.t.</w:t>
+      </w:r>
+      <w:proofErr w:type="spellEnd"/>
+      <w:r>
+        <w:rPr>
+          <w:rFonts w:ascii="Computer modern" w:hAnsi="Computer modern"/>
+          <w:sz w:val="26"/>
+          <w:szCs w:val="28"/>
+        </w:rPr>
+        <w:t xml:space="preserve"> stochastic objective at timestep t</w:t>
       </w:r>
     </w:p>
     <w:p>
@@ -2077,7 +1944,6 @@
           <w:rFonts w:ascii="Computer modern" w:hAnsi="Computer modern"/>
           <w:sz w:val="26"/>
           <w:szCs w:val="28"/>
-          <w:lang/>
         </w:rPr>
       </w:pPr>
       <m:oMathPara>
@@ -2090,7 +1956,6 @@
               <w:rFonts w:ascii="Cambria Math" w:hAnsi="Cambria Math"/>
               <w:sz w:val="26"/>
               <w:szCs w:val="28"/>
-              <w:lang/>
             </w:rPr>
             <m:t xml:space="preserve"> </m:t>
           </m:r>
@@ -2101,7 +1966,6 @@
                   <w:rFonts w:ascii="Cambria Math" w:hAnsi="Cambria Math"/>
                   <w:sz w:val="26"/>
                   <w:szCs w:val="28"/>
-                  <w:lang/>
                 </w:rPr>
               </m:ctrlPr>
             </m:sSubPr>
@@ -2111,7 +1975,6 @@
                   <w:rFonts w:ascii="Cambria Math" w:hAnsi="Cambria Math"/>
                   <w:sz w:val="26"/>
                   <w:szCs w:val="28"/>
-                  <w:lang/>
                 </w:rPr>
                 <m:t>g</m:t>
               </m:r>
@@ -2122,7 +1985,6 @@
                   <w:rFonts w:ascii="Cambria Math" w:hAnsi="Cambria Math"/>
                   <w:sz w:val="26"/>
                   <w:szCs w:val="28"/>
-                  <w:lang/>
                 </w:rPr>
                 <m:t>t</m:t>
               </m:r>
@@ -2136,7 +1998,6 @@
               <w:rFonts w:ascii="Cambria Math" w:hAnsi="Cambria Math"/>
               <w:sz w:val="26"/>
               <w:szCs w:val="28"/>
-              <w:lang/>
             </w:rPr>
             <m:t>=</m:t>
           </m:r>
@@ -2147,7 +2008,6 @@
                   <w:rFonts w:ascii="Cambria Math" w:hAnsi="Cambria Math"/>
                   <w:sz w:val="26"/>
                   <w:szCs w:val="28"/>
-                  <w:lang/>
                 </w:rPr>
               </m:ctrlPr>
             </m:sSubPr>
@@ -2160,7 +2020,6 @@
                   <w:rFonts w:ascii="Cambria Math" w:hAnsi="Cambria Math"/>
                   <w:sz w:val="26"/>
                   <w:szCs w:val="28"/>
-                  <w:lang/>
                 </w:rPr>
                 <m:t>∇</m:t>
               </m:r>
@@ -2174,7 +2033,6 @@
                   <w:rFonts w:ascii="Cambria Math" w:hAnsi="Cambria Math"/>
                   <w:sz w:val="26"/>
                   <w:szCs w:val="28"/>
-                  <w:lang/>
                 </w:rPr>
                 <m:t>θ</m:t>
               </m:r>
@@ -2187,7 +2045,6 @@
                   <w:rFonts w:ascii="Cambria Math" w:hAnsi="Cambria Math"/>
                   <w:sz w:val="26"/>
                   <w:szCs w:val="28"/>
-                  <w:lang/>
                 </w:rPr>
               </m:ctrlPr>
             </m:sSubPr>
@@ -2200,7 +2057,6 @@
                   <w:rFonts w:ascii="Cambria Math" w:hAnsi="Cambria Math"/>
                   <w:sz w:val="26"/>
                   <w:szCs w:val="28"/>
-                  <w:lang/>
                 </w:rPr>
                 <m:t>f</m:t>
               </m:r>
@@ -2214,7 +2070,6 @@
                   <w:rFonts w:ascii="Cambria Math" w:hAnsi="Cambria Math"/>
                   <w:sz w:val="26"/>
                   <w:szCs w:val="28"/>
-                  <w:lang/>
                 </w:rPr>
                 <m:t>t</m:t>
               </m:r>
@@ -2228,7 +2083,6 @@
               <w:rFonts w:ascii="Cambria Math" w:hAnsi="Cambria Math"/>
               <w:sz w:val="26"/>
               <w:szCs w:val="28"/>
-              <w:lang/>
             </w:rPr>
             <m:t>(</m:t>
           </m:r>
@@ -2239,7 +2093,6 @@
                   <w:rFonts w:ascii="Cambria Math" w:hAnsi="Cambria Math"/>
                   <w:sz w:val="26"/>
                   <w:szCs w:val="28"/>
-                  <w:lang/>
                 </w:rPr>
               </m:ctrlPr>
             </m:sSubPr>
@@ -2252,7 +2105,6 @@
                   <w:rFonts w:ascii="Cambria Math" w:hAnsi="Cambria Math"/>
                   <w:sz w:val="26"/>
                   <w:szCs w:val="28"/>
-                  <w:lang/>
                 </w:rPr>
                 <m:t>θ</m:t>
               </m:r>
@@ -2266,7 +2118,6 @@
                   <w:rFonts w:ascii="Cambria Math" w:hAnsi="Cambria Math"/>
                   <w:sz w:val="26"/>
                   <w:szCs w:val="28"/>
-                  <w:lang/>
                 </w:rPr>
                 <m:t>t-1</m:t>
               </m:r>
@@ -2280,7 +2131,6 @@
               <w:rFonts w:ascii="Cambria Math" w:hAnsi="Cambria Math"/>
               <w:sz w:val="26"/>
               <w:szCs w:val="28"/>
-              <w:lang/>
             </w:rPr>
             <m:t>)</m:t>
           </m:r>
@@ -2289,7 +2139,6 @@
               <w:rFonts w:ascii="Cambria Math" w:hAnsi="Cambria Math"/>
               <w:sz w:val="26"/>
               <w:szCs w:val="28"/>
-              <w:lang/>
             </w:rPr>
             <m:t xml:space="preserve"> </m:t>
           </m:r>
@@ -2312,15 +2161,13 @@
           <w:rFonts w:ascii="Computer modern" w:hAnsi="Computer modern"/>
           <w:sz w:val="26"/>
           <w:szCs w:val="28"/>
-          <w:lang/>
-        </w:rPr>
-      </w:pPr>
-      <w:r>
-        <w:rPr>
-          <w:rFonts w:ascii="Computer modern" w:hAnsi="Computer modern"/>
-          <w:sz w:val="26"/>
-          <w:szCs w:val="28"/>
-          <w:lang/>
+        </w:rPr>
+      </w:pPr>
+      <w:r>
+        <w:rPr>
+          <w:rFonts w:ascii="Computer modern" w:hAnsi="Computer modern"/>
+          <w:sz w:val="26"/>
+          <w:szCs w:val="28"/>
         </w:rPr>
         <w:t xml:space="preserve">Update </w:t>
       </w:r>
@@ -2329,7 +2176,6 @@
           <w:rFonts w:ascii="Computer modern" w:hAnsi="Computer modern"/>
           <w:sz w:val="26"/>
           <w:szCs w:val="28"/>
-          <w:lang/>
         </w:rPr>
         <w:t>exponential moving averages of the gradient (</w:t>
       </w:r>
@@ -2338,7 +2184,6 @@
           <w:rFonts w:ascii="Computer modern" w:hAnsi="Computer modern"/>
           <w:sz w:val="26"/>
           <w:szCs w:val="28"/>
-          <w:lang/>
         </w:rPr>
         <w:t>biased first moment estimate</w:t>
       </w:r>
@@ -2347,7 +2192,6 @@
           <w:rFonts w:ascii="Computer modern" w:hAnsi="Computer modern"/>
           <w:sz w:val="26"/>
           <w:szCs w:val="28"/>
-          <w:lang/>
         </w:rPr>
         <w:t>)</w:t>
       </w:r>
@@ -2356,7 +2200,6 @@
           <w:rFonts w:ascii="Computer modern" w:hAnsi="Computer modern"/>
           <w:sz w:val="26"/>
           <w:szCs w:val="28"/>
-          <w:lang/>
         </w:rPr>
         <w:t>,</w:t>
       </w:r>
@@ -2368,7 +2211,6 @@
           <w:rFonts w:ascii="Computer modern" w:hAnsi="Computer modern"/>
           <w:sz w:val="26"/>
           <w:szCs w:val="28"/>
-          <w:lang/>
         </w:rPr>
       </w:pPr>
       <m:oMathPara>
@@ -2381,7 +2223,6 @@
                   <w:i/>
                   <w:sz w:val="26"/>
                   <w:szCs w:val="28"/>
-                  <w:lang/>
                 </w:rPr>
               </m:ctrlPr>
             </m:sSubPr>
@@ -2391,7 +2232,6 @@
                   <w:rFonts w:ascii="Cambria Math" w:hAnsi="Cambria Math"/>
                   <w:sz w:val="26"/>
                   <w:szCs w:val="28"/>
-                  <w:lang/>
                 </w:rPr>
                 <m:t>m</m:t>
               </m:r>
@@ -2402,7 +2242,6 @@
                   <w:rFonts w:ascii="Cambria Math" w:hAnsi="Cambria Math"/>
                   <w:sz w:val="26"/>
                   <w:szCs w:val="28"/>
-                  <w:lang/>
                 </w:rPr>
                 <m:t>t</m:t>
               </m:r>
@@ -2416,7 +2255,6 @@
               <w:rFonts w:ascii="Cambria Math" w:hAnsi="Cambria Math"/>
               <w:sz w:val="26"/>
               <w:szCs w:val="28"/>
-              <w:lang/>
             </w:rPr>
             <m:t xml:space="preserve">= </m:t>
           </m:r>
@@ -2428,7 +2266,6 @@
                   <w:i/>
                   <w:sz w:val="26"/>
                   <w:szCs w:val="28"/>
-                  <w:lang/>
                 </w:rPr>
               </m:ctrlPr>
             </m:sSubPr>
@@ -2438,7 +2275,6 @@
                   <w:rFonts w:ascii="Cambria Math" w:hAnsi="Cambria Math"/>
                   <w:sz w:val="26"/>
                   <w:szCs w:val="28"/>
-                  <w:lang/>
                 </w:rPr>
                 <m:t>β</m:t>
               </m:r>
@@ -2449,7 +2285,6 @@
                   <w:rFonts w:ascii="Cambria Math" w:hAnsi="Cambria Math"/>
                   <w:sz w:val="26"/>
                   <w:szCs w:val="28"/>
-                  <w:lang/>
                 </w:rPr>
                 <m:t>1,t</m:t>
               </m:r>
@@ -2463,7 +2298,6 @@
               <w:rFonts w:ascii="Cambria Math" w:hAnsi="Cambria Math"/>
               <w:sz w:val="26"/>
               <w:szCs w:val="28"/>
-              <w:lang/>
             </w:rPr>
             <m:t>·</m:t>
           </m:r>
@@ -2475,7 +2309,6 @@
                   <w:i/>
                   <w:sz w:val="26"/>
                   <w:szCs w:val="28"/>
-                  <w:lang/>
                 </w:rPr>
               </m:ctrlPr>
             </m:sSubPr>
@@ -2485,7 +2318,6 @@
                   <w:rFonts w:ascii="Cambria Math" w:hAnsi="Cambria Math"/>
                   <w:sz w:val="26"/>
                   <w:szCs w:val="28"/>
-                  <w:lang/>
                 </w:rPr>
                 <m:t>m</m:t>
               </m:r>
@@ -2496,7 +2328,6 @@
                   <w:rFonts w:ascii="Cambria Math" w:hAnsi="Cambria Math"/>
                   <w:sz w:val="26"/>
                   <w:szCs w:val="28"/>
-                  <w:lang/>
                 </w:rPr>
                 <m:t>t</m:t>
               </m:r>
@@ -2508,7 +2339,6 @@
                   <w:rFonts w:ascii="Cambria Math" w:hAnsi="Cambria Math"/>
                   <w:sz w:val="26"/>
                   <w:szCs w:val="28"/>
-                  <w:lang/>
                 </w:rPr>
                 <m:t>-1</m:t>
               </m:r>
@@ -2522,7 +2352,6 @@
               <w:rFonts w:ascii="Cambria Math" w:hAnsi="Cambria Math"/>
               <w:sz w:val="26"/>
               <w:szCs w:val="28"/>
-              <w:lang/>
             </w:rPr>
             <m:t>+(1-</m:t>
           </m:r>
@@ -2534,7 +2363,6 @@
                   <w:i/>
                   <w:sz w:val="26"/>
                   <w:szCs w:val="28"/>
-                  <w:lang/>
                 </w:rPr>
               </m:ctrlPr>
             </m:sSubPr>
@@ -2544,7 +2372,6 @@
                   <w:rFonts w:ascii="Cambria Math" w:hAnsi="Cambria Math"/>
                   <w:sz w:val="26"/>
                   <w:szCs w:val="28"/>
-                  <w:lang/>
                 </w:rPr>
                 <m:t>β</m:t>
               </m:r>
@@ -2555,7 +2382,6 @@
                   <w:rFonts w:ascii="Cambria Math" w:hAnsi="Cambria Math"/>
                   <w:sz w:val="26"/>
                   <w:szCs w:val="28"/>
-                  <w:lang/>
                 </w:rPr>
                 <m:t>1,t</m:t>
               </m:r>
@@ -2569,7 +2395,6 @@
               <w:rFonts w:ascii="Cambria Math" w:hAnsi="Cambria Math"/>
               <w:sz w:val="26"/>
               <w:szCs w:val="28"/>
-              <w:lang/>
             </w:rPr>
             <m:t>)·</m:t>
           </m:r>
@@ -2581,7 +2406,6 @@
                   <w:i/>
                   <w:sz w:val="26"/>
                   <w:szCs w:val="28"/>
-                  <w:lang/>
                 </w:rPr>
               </m:ctrlPr>
             </m:sSubPr>
@@ -2591,7 +2415,6 @@
                   <w:rFonts w:ascii="Cambria Math" w:hAnsi="Cambria Math"/>
                   <w:sz w:val="26"/>
                   <w:szCs w:val="28"/>
-                  <w:lang/>
                 </w:rPr>
                 <m:t>g</m:t>
               </m:r>
@@ -2602,7 +2425,6 @@
                   <w:rFonts w:ascii="Cambria Math" w:hAnsi="Cambria Math"/>
                   <w:sz w:val="26"/>
                   <w:szCs w:val="28"/>
-                  <w:lang/>
                 </w:rPr>
                 <m:t>t</m:t>
               </m:r>
@@ -2627,15 +2449,13 @@
           <w:rFonts w:ascii="Computer modern" w:hAnsi="Computer modern"/>
           <w:sz w:val="26"/>
           <w:szCs w:val="28"/>
-          <w:lang/>
-        </w:rPr>
-      </w:pPr>
-      <w:r>
-        <w:rPr>
-          <w:rFonts w:ascii="Computer modern" w:hAnsi="Computer modern"/>
-          <w:sz w:val="26"/>
-          <w:szCs w:val="28"/>
-          <w:lang/>
+        </w:rPr>
+      </w:pPr>
+      <w:r>
+        <w:rPr>
+          <w:rFonts w:ascii="Computer modern" w:hAnsi="Computer modern"/>
+          <w:sz w:val="26"/>
+          <w:szCs w:val="28"/>
         </w:rPr>
         <w:t xml:space="preserve">Update </w:t>
       </w:r>
@@ -2644,7 +2464,6 @@
           <w:rFonts w:ascii="Computer modern" w:hAnsi="Computer modern"/>
           <w:sz w:val="26"/>
           <w:szCs w:val="28"/>
-          <w:lang/>
         </w:rPr>
         <w:t>squared gradient (</w:t>
       </w:r>
@@ -2653,7 +2472,6 @@
           <w:rFonts w:ascii="Computer modern" w:hAnsi="Computer modern"/>
           <w:sz w:val="26"/>
           <w:szCs w:val="28"/>
-          <w:lang/>
         </w:rPr>
         <w:t>biased second raw moment estimate</w:t>
       </w:r>
@@ -2662,9 +2480,8 @@
           <w:rFonts w:ascii="Computer modern" w:hAnsi="Computer modern"/>
           <w:sz w:val="26"/>
           <w:szCs w:val="28"/>
-          <w:lang/>
-        </w:rPr>
-        <w:t>),</w:t>
+        </w:rPr>
+        <w:t>)</w:t>
       </w:r>
     </w:p>
     <w:p>
@@ -2674,7 +2491,6 @@
           <w:rFonts w:ascii="Computer modern" w:hAnsi="Computer modern"/>
           <w:sz w:val="26"/>
           <w:szCs w:val="28"/>
-          <w:lang/>
         </w:rPr>
       </w:pPr>
       <m:oMathPara>
@@ -2687,7 +2503,6 @@
                   <w:i/>
                   <w:sz w:val="26"/>
                   <w:szCs w:val="28"/>
-                  <w:lang/>
                 </w:rPr>
               </m:ctrlPr>
             </m:sSubPr>
@@ -2697,7 +2512,6 @@
                   <w:rFonts w:ascii="Cambria Math" w:hAnsi="Cambria Math"/>
                   <w:sz w:val="26"/>
                   <w:szCs w:val="28"/>
-                  <w:lang/>
                 </w:rPr>
                 <m:t>v</m:t>
               </m:r>
@@ -2708,7 +2522,6 @@
                   <w:rFonts w:ascii="Cambria Math" w:hAnsi="Cambria Math"/>
                   <w:sz w:val="26"/>
                   <w:szCs w:val="28"/>
-                  <w:lang/>
                 </w:rPr>
                 <m:t>t</m:t>
               </m:r>
@@ -2722,7 +2535,6 @@
               <w:rFonts w:ascii="Cambria Math" w:hAnsi="Cambria Math"/>
               <w:sz w:val="26"/>
               <w:szCs w:val="28"/>
-              <w:lang/>
             </w:rPr>
             <m:t xml:space="preserve">= </m:t>
           </m:r>
@@ -2734,7 +2546,6 @@
                   <w:i/>
                   <w:sz w:val="26"/>
                   <w:szCs w:val="28"/>
-                  <w:lang/>
                 </w:rPr>
               </m:ctrlPr>
             </m:sSubPr>
@@ -2744,7 +2555,6 @@
                   <w:rFonts w:ascii="Cambria Math" w:hAnsi="Cambria Math"/>
                   <w:sz w:val="26"/>
                   <w:szCs w:val="28"/>
-                  <w:lang/>
                 </w:rPr>
                 <m:t>β</m:t>
               </m:r>
@@ -2755,7 +2565,6 @@
                   <w:rFonts w:ascii="Cambria Math" w:hAnsi="Cambria Math"/>
                   <w:sz w:val="26"/>
                   <w:szCs w:val="28"/>
-                  <w:lang/>
                 </w:rPr>
                 <m:t>2</m:t>
               </m:r>
@@ -2769,7 +2578,6 @@
               <w:rFonts w:ascii="Cambria Math" w:hAnsi="Cambria Math"/>
               <w:sz w:val="26"/>
               <w:szCs w:val="28"/>
-              <w:lang/>
             </w:rPr>
             <m:t xml:space="preserve">· </m:t>
           </m:r>
@@ -2781,7 +2589,6 @@
                   <w:i/>
                   <w:sz w:val="26"/>
                   <w:szCs w:val="28"/>
-                  <w:lang/>
                 </w:rPr>
               </m:ctrlPr>
             </m:sSubPr>
@@ -2791,7 +2598,6 @@
                   <w:rFonts w:ascii="Cambria Math" w:hAnsi="Cambria Math"/>
                   <w:sz w:val="26"/>
                   <w:szCs w:val="28"/>
-                  <w:lang/>
                 </w:rPr>
                 <m:t>v</m:t>
               </m:r>
@@ -2802,7 +2608,6 @@
                   <w:rFonts w:ascii="Cambria Math" w:hAnsi="Cambria Math"/>
                   <w:sz w:val="26"/>
                   <w:szCs w:val="28"/>
-                  <w:lang/>
                 </w:rPr>
                 <m:t>t</m:t>
               </m:r>
@@ -2814,7 +2619,6 @@
                   <w:rFonts w:ascii="Cambria Math" w:hAnsi="Cambria Math"/>
                   <w:sz w:val="26"/>
                   <w:szCs w:val="28"/>
-                  <w:lang/>
                 </w:rPr>
                 <m:t>-1</m:t>
               </m:r>
@@ -2828,7 +2632,6 @@
               <w:rFonts w:ascii="Cambria Math" w:hAnsi="Cambria Math"/>
               <w:sz w:val="26"/>
               <w:szCs w:val="28"/>
-              <w:lang/>
             </w:rPr>
             <m:t xml:space="preserve"> + (1 - </m:t>
           </m:r>
@@ -2840,7 +2643,6 @@
                   <w:i/>
                   <w:sz w:val="26"/>
                   <w:szCs w:val="28"/>
-                  <w:lang/>
                 </w:rPr>
               </m:ctrlPr>
             </m:sSubSupPr>
@@ -2850,7 +2652,6 @@
                   <w:rFonts w:ascii="Cambria Math" w:hAnsi="Cambria Math"/>
                   <w:sz w:val="26"/>
                   <w:szCs w:val="28"/>
-                  <w:lang/>
                 </w:rPr>
                 <m:t>β</m:t>
               </m:r>
@@ -2861,7 +2662,6 @@
                   <w:rFonts w:ascii="Cambria Math" w:hAnsi="Cambria Math"/>
                   <w:sz w:val="26"/>
                   <w:szCs w:val="28"/>
-                  <w:lang/>
                 </w:rPr>
                 <m:t>2</m:t>
               </m:r>
@@ -2872,7 +2672,6 @@
                   <w:rFonts w:ascii="Cambria Math" w:hAnsi="Cambria Math"/>
                   <w:sz w:val="26"/>
                   <w:szCs w:val="28"/>
-                  <w:lang/>
                 </w:rPr>
                 <m:t>t</m:t>
               </m:r>
@@ -2886,7 +2685,6 @@
               <w:rFonts w:ascii="Cambria Math" w:hAnsi="Cambria Math"/>
               <w:sz w:val="26"/>
               <w:szCs w:val="28"/>
-              <w:lang/>
             </w:rPr>
             <m:t>)·</m:t>
           </m:r>
@@ -2898,7 +2696,6 @@
                   <w:i/>
                   <w:sz w:val="26"/>
                   <w:szCs w:val="28"/>
-                  <w:lang/>
                 </w:rPr>
               </m:ctrlPr>
             </m:sSubSupPr>
@@ -2911,7 +2708,6 @@
                   <w:rFonts w:ascii="Cambria Math" w:hAnsi="Cambria Math"/>
                   <w:sz w:val="26"/>
                   <w:szCs w:val="28"/>
-                  <w:lang/>
                 </w:rPr>
                 <m:t>g</m:t>
               </m:r>
@@ -2922,7 +2718,6 @@
                   <w:rFonts w:ascii="Cambria Math" w:hAnsi="Cambria Math"/>
                   <w:sz w:val="26"/>
                   <w:szCs w:val="28"/>
-                  <w:lang/>
                 </w:rPr>
                 <m:t>t</m:t>
               </m:r>
@@ -2933,7 +2728,6 @@
                   <w:rFonts w:ascii="Cambria Math" w:hAnsi="Cambria Math"/>
                   <w:sz w:val="26"/>
                   <w:szCs w:val="28"/>
-                  <w:lang/>
                 </w:rPr>
                 <m:t>2</m:t>
               </m:r>
@@ -2950,15 +2744,13 @@
           <w:rFonts w:ascii="Computer modern" w:hAnsi="Computer modern"/>
           <w:sz w:val="26"/>
           <w:szCs w:val="28"/>
-          <w:lang/>
-        </w:rPr>
-      </w:pPr>
-      <w:r>
-        <w:rPr>
-          <w:rFonts w:ascii="Computer modern" w:hAnsi="Computer modern"/>
-          <w:sz w:val="26"/>
-          <w:szCs w:val="28"/>
-          <w:lang/>
+        </w:rPr>
+      </w:pPr>
+      <w:r>
+        <w:rPr>
+          <w:rFonts w:ascii="Computer modern" w:hAnsi="Computer modern"/>
+          <w:sz w:val="26"/>
+          <w:szCs w:val="28"/>
         </w:rPr>
         <w:t>T</w:t>
       </w:r>
@@ -2967,7 +2759,6 @@
           <w:rFonts w:ascii="Computer modern" w:hAnsi="Computer modern"/>
           <w:sz w:val="26"/>
           <w:szCs w:val="28"/>
-          <w:lang/>
         </w:rPr>
         <w:t>hese moving averages are</w:t>
       </w:r>
@@ -2976,7 +2767,6 @@
           <w:rFonts w:ascii="Computer modern" w:hAnsi="Computer modern"/>
           <w:sz w:val="26"/>
           <w:szCs w:val="28"/>
-          <w:lang/>
         </w:rPr>
         <w:t xml:space="preserve"> </w:t>
       </w:r>
@@ -2985,7 +2775,6 @@
           <w:rFonts w:ascii="Computer modern" w:hAnsi="Computer modern"/>
           <w:sz w:val="26"/>
           <w:szCs w:val="28"/>
-          <w:lang/>
         </w:rPr>
         <w:t>initialized as (vectors of) 0’s, leading to moment estimates that are biased towards zero, especially</w:t>
       </w:r>
@@ -2994,7 +2783,6 @@
           <w:rFonts w:ascii="Computer modern" w:hAnsi="Computer modern"/>
           <w:sz w:val="26"/>
           <w:szCs w:val="28"/>
-          <w:lang/>
         </w:rPr>
         <w:t xml:space="preserve"> </w:t>
       </w:r>
@@ -3003,7 +2791,6 @@
           <w:rFonts w:ascii="Computer modern" w:hAnsi="Computer modern"/>
           <w:sz w:val="26"/>
           <w:szCs w:val="28"/>
-          <w:lang/>
         </w:rPr>
         <w:t xml:space="preserve">during the initial timesteps, and especially when the decay rates are small (i.e. the </w:t>
       </w:r>
@@ -3016,7 +2803,6 @@
                 <w:i/>
                 <w:sz w:val="26"/>
                 <w:szCs w:val="28"/>
-                <w:lang/>
               </w:rPr>
             </m:ctrlPr>
           </m:sSubPr>
@@ -3026,7 +2812,6 @@
                 <w:rFonts w:ascii="Cambria Math" w:hAnsi="Cambria Math"/>
                 <w:sz w:val="26"/>
                 <w:szCs w:val="28"/>
-                <w:lang/>
               </w:rPr>
               <m:t>β</m:t>
             </m:r>
@@ -3037,7 +2822,6 @@
                 <w:rFonts w:ascii="Cambria Math" w:hAnsi="Cambria Math"/>
                 <w:sz w:val="26"/>
                 <w:szCs w:val="28"/>
-                <w:lang/>
               </w:rPr>
               <m:t>S</m:t>
             </m:r>
@@ -3049,7 +2833,6 @@
           <w:rFonts w:ascii="Computer modern" w:hAnsi="Computer modern"/>
           <w:sz w:val="26"/>
           <w:szCs w:val="28"/>
-          <w:lang/>
         </w:rPr>
         <w:t xml:space="preserve"> are close to 1).</w:t>
       </w:r>
@@ -3061,15 +2844,13 @@
           <w:rFonts w:ascii="Computer modern" w:eastAsiaTheme="minorEastAsia" w:hAnsi="Computer modern"/>
           <w:sz w:val="26"/>
           <w:szCs w:val="28"/>
-          <w:lang/>
-        </w:rPr>
-      </w:pPr>
-      <w:r>
-        <w:rPr>
-          <w:rFonts w:ascii="Computer modern" w:hAnsi="Computer modern"/>
-          <w:sz w:val="26"/>
-          <w:szCs w:val="28"/>
-          <w:lang/>
+        </w:rPr>
+      </w:pPr>
+      <w:r>
+        <w:rPr>
+          <w:rFonts w:ascii="Computer modern" w:hAnsi="Computer modern"/>
+          <w:sz w:val="26"/>
+          <w:szCs w:val="28"/>
         </w:rPr>
         <w:t>T</w:t>
       </w:r>
@@ -3078,7 +2859,6 @@
           <w:rFonts w:ascii="Computer modern" w:hAnsi="Computer modern"/>
           <w:sz w:val="26"/>
           <w:szCs w:val="28"/>
-          <w:lang/>
         </w:rPr>
         <w:t>his initialization bias can be easily counteracted, resulting in bias-corrected</w:t>
       </w:r>
@@ -3087,7 +2867,6 @@
           <w:rFonts w:ascii="Computer modern" w:hAnsi="Computer modern"/>
           <w:sz w:val="26"/>
           <w:szCs w:val="28"/>
-          <w:lang/>
         </w:rPr>
         <w:t xml:space="preserve"> </w:t>
       </w:r>
@@ -3096,7 +2875,6 @@
           <w:rFonts w:ascii="Computer modern" w:hAnsi="Computer modern"/>
           <w:sz w:val="26"/>
           <w:szCs w:val="28"/>
-          <w:lang/>
         </w:rPr>
         <w:t xml:space="preserve">estimates </w:t>
       </w:r>
@@ -3109,7 +2887,6 @@
                 <w:i/>
                 <w:sz w:val="26"/>
                 <w:szCs w:val="28"/>
-                <w:lang/>
               </w:rPr>
             </m:ctrlPr>
           </m:sSubPr>
@@ -3122,7 +2899,6 @@
                     <w:i/>
                     <w:sz w:val="26"/>
                     <w:szCs w:val="28"/>
-                    <w:lang/>
                   </w:rPr>
                 </m:ctrlPr>
               </m:accPr>
@@ -3132,7 +2908,6 @@
                     <w:rFonts w:ascii="Cambria Math" w:hAnsi="Cambria Math"/>
                     <w:sz w:val="26"/>
                     <w:szCs w:val="28"/>
-                    <w:lang/>
                   </w:rPr>
                   <m:t>m</m:t>
                 </m:r>
@@ -3145,7 +2920,6 @@
                 <w:rFonts w:ascii="Cambria Math" w:hAnsi="Cambria Math"/>
                 <w:sz w:val="26"/>
                 <w:szCs w:val="28"/>
-                <w:lang/>
               </w:rPr>
               <m:t>t</m:t>
             </m:r>
@@ -3157,7 +2931,6 @@
           <w:rFonts w:ascii="Computer modern" w:hAnsi="Computer modern"/>
           <w:sz w:val="26"/>
           <w:szCs w:val="28"/>
-          <w:lang/>
         </w:rPr>
         <w:t xml:space="preserve"> and </w:t>
       </w:r>
@@ -3170,7 +2943,6 @@
                 <w:i/>
                 <w:sz w:val="26"/>
                 <w:szCs w:val="28"/>
-                <w:lang/>
               </w:rPr>
             </m:ctrlPr>
           </m:sSubPr>
@@ -3183,7 +2955,6 @@
                     <w:i/>
                     <w:sz w:val="26"/>
                     <w:szCs w:val="28"/>
-                    <w:lang/>
                   </w:rPr>
                 </m:ctrlPr>
               </m:accPr>
@@ -3193,7 +2964,6 @@
                     <w:rFonts w:ascii="Cambria Math" w:hAnsi="Cambria Math"/>
                     <w:sz w:val="26"/>
                     <w:szCs w:val="28"/>
-                    <w:lang/>
                   </w:rPr>
                   <m:t>v</m:t>
                 </m:r>
@@ -3206,7 +2976,6 @@
                 <w:rFonts w:ascii="Cambria Math" w:hAnsi="Cambria Math"/>
                 <w:sz w:val="26"/>
                 <w:szCs w:val="28"/>
-                <w:lang/>
               </w:rPr>
               <m:t>t</m:t>
             </m:r>
@@ -3217,7 +2986,6 @@
             <w:rFonts w:ascii="Cambria Math" w:hAnsi="Cambria Math"/>
             <w:sz w:val="26"/>
             <w:szCs w:val="28"/>
-            <w:lang/>
           </w:rPr>
           <m:t>.</m:t>
         </m:r>
@@ -3239,17 +3007,15 @@
           <w:rFonts w:ascii="Computer modern" w:hAnsi="Computer modern"/>
           <w:sz w:val="26"/>
           <w:szCs w:val="28"/>
-          <w:lang/>
-        </w:rPr>
-      </w:pPr>
-      <w:r>
-        <w:rPr>
-          <w:rFonts w:ascii="Computer modern" w:hAnsi="Computer modern"/>
-          <w:sz w:val="26"/>
-          <w:szCs w:val="28"/>
-          <w:lang/>
-        </w:rPr>
-        <w:t>Compute bias-corrected first moment estimate,</w:t>
+        </w:rPr>
+      </w:pPr>
+      <w:r>
+        <w:rPr>
+          <w:rFonts w:ascii="Computer modern" w:hAnsi="Computer modern"/>
+          <w:sz w:val="26"/>
+          <w:szCs w:val="28"/>
+        </w:rPr>
+        <w:t>Compute bias-corrected first moment estimate</w:t>
       </w:r>
     </w:p>
     <w:p>
@@ -3259,7 +3025,6 @@
           <w:rFonts w:ascii="Computer modern" w:hAnsi="Computer modern"/>
           <w:sz w:val="26"/>
           <w:szCs w:val="28"/>
-          <w:lang/>
         </w:rPr>
       </w:pPr>
       <m:oMathPara>
@@ -3272,7 +3037,6 @@
                   <w:i/>
                   <w:sz w:val="26"/>
                   <w:szCs w:val="28"/>
-                  <w:lang/>
                 </w:rPr>
               </m:ctrlPr>
             </m:sSubPr>
@@ -3285,7 +3049,6 @@
                       <w:i/>
                       <w:sz w:val="26"/>
                       <w:szCs w:val="28"/>
-                      <w:lang/>
                     </w:rPr>
                   </m:ctrlPr>
                 </m:accPr>
@@ -3295,7 +3058,6 @@
                       <w:rFonts w:ascii="Cambria Math" w:hAnsi="Cambria Math"/>
                       <w:sz w:val="26"/>
                       <w:szCs w:val="28"/>
-                      <w:lang/>
                     </w:rPr>
                     <m:t>m</m:t>
                   </m:r>
@@ -3308,7 +3070,6 @@
                   <w:rFonts w:ascii="Cambria Math" w:hAnsi="Cambria Math"/>
                   <w:sz w:val="26"/>
                   <w:szCs w:val="28"/>
-                  <w:lang/>
                 </w:rPr>
                 <m:t>t</m:t>
               </m:r>
@@ -3322,7 +3083,6 @@
               <w:rFonts w:ascii="Cambria Math" w:hAnsi="Cambria Math"/>
               <w:sz w:val="26"/>
               <w:szCs w:val="28"/>
-              <w:lang/>
             </w:rPr>
             <m:t xml:space="preserve">= </m:t>
           </m:r>
@@ -3334,7 +3094,6 @@
                   <w:i/>
                   <w:sz w:val="26"/>
                   <w:szCs w:val="28"/>
-                  <w:lang/>
                 </w:rPr>
               </m:ctrlPr>
             </m:fPr>
@@ -3347,7 +3106,6 @@
                       <w:i/>
                       <w:sz w:val="26"/>
                       <w:szCs w:val="28"/>
-                      <w:lang/>
                     </w:rPr>
                   </m:ctrlPr>
                 </m:sSubPr>
@@ -3357,7 +3115,6 @@
                       <w:rFonts w:ascii="Cambria Math" w:hAnsi="Cambria Math"/>
                       <w:sz w:val="26"/>
                       <w:szCs w:val="28"/>
-                      <w:lang/>
                     </w:rPr>
                     <m:t>m</m:t>
                   </m:r>
@@ -3368,7 +3125,6 @@
                       <w:rFonts w:ascii="Cambria Math" w:hAnsi="Cambria Math"/>
                       <w:sz w:val="26"/>
                       <w:szCs w:val="28"/>
-                      <w:lang/>
                     </w:rPr>
                     <m:t>t</m:t>
                   </m:r>
@@ -3384,7 +3140,6 @@
                   <w:rFonts w:ascii="Cambria Math" w:hAnsi="Cambria Math"/>
                   <w:sz w:val="26"/>
                   <w:szCs w:val="28"/>
-                  <w:lang/>
                 </w:rPr>
                 <m:t>(1-</m:t>
               </m:r>
@@ -3396,7 +3151,6 @@
                       <w:i/>
                       <w:sz w:val="26"/>
                       <w:szCs w:val="28"/>
-                      <w:lang/>
                     </w:rPr>
                   </m:ctrlPr>
                 </m:sSubSupPr>
@@ -3406,7 +3160,6 @@
                       <w:rFonts w:ascii="Cambria Math" w:hAnsi="Cambria Math"/>
                       <w:sz w:val="26"/>
                       <w:szCs w:val="28"/>
-                      <w:lang/>
                     </w:rPr>
                     <m:t>β</m:t>
                   </m:r>
@@ -3417,7 +3170,6 @@
                       <w:rFonts w:ascii="Cambria Math" w:hAnsi="Cambria Math"/>
                       <w:sz w:val="26"/>
                       <w:szCs w:val="28"/>
-                      <w:lang/>
                     </w:rPr>
                     <m:t>1</m:t>
                   </m:r>
@@ -3428,7 +3180,6 @@
                       <w:rFonts w:ascii="Cambria Math" w:hAnsi="Cambria Math"/>
                       <w:sz w:val="26"/>
                       <w:szCs w:val="28"/>
-                      <w:lang/>
                     </w:rPr>
                     <m:t>t</m:t>
                   </m:r>
@@ -3442,7 +3193,6 @@
                   <w:rFonts w:ascii="Cambria Math" w:hAnsi="Cambria Math"/>
                   <w:sz w:val="26"/>
                   <w:szCs w:val="28"/>
-                  <w:lang/>
                 </w:rPr>
                 <m:t>)</m:t>
               </m:r>
@@ -3467,15 +3217,13 @@
           <w:rFonts w:ascii="Computer modern" w:hAnsi="Computer modern"/>
           <w:sz w:val="26"/>
           <w:szCs w:val="28"/>
-          <w:lang/>
-        </w:rPr>
-      </w:pPr>
-      <w:r>
-        <w:rPr>
-          <w:rFonts w:ascii="Computer modern" w:hAnsi="Computer modern"/>
-          <w:sz w:val="26"/>
-          <w:szCs w:val="28"/>
-          <w:lang/>
+        </w:rPr>
+      </w:pPr>
+      <w:r>
+        <w:rPr>
+          <w:rFonts w:ascii="Computer modern" w:hAnsi="Computer modern"/>
+          <w:sz w:val="26"/>
+          <w:szCs w:val="28"/>
         </w:rPr>
         <w:t xml:space="preserve">Compute bias-corrected </w:t>
       </w:r>
@@ -3484,7 +3232,6 @@
           <w:rFonts w:ascii="Computer modern" w:hAnsi="Computer modern"/>
           <w:sz w:val="26"/>
           <w:szCs w:val="28"/>
-          <w:lang/>
         </w:rPr>
         <w:t>second</w:t>
       </w:r>
@@ -3493,9 +3240,8 @@
           <w:rFonts w:ascii="Computer modern" w:hAnsi="Computer modern"/>
           <w:sz w:val="26"/>
           <w:szCs w:val="28"/>
-          <w:lang/>
-        </w:rPr>
-        <w:t xml:space="preserve"> moment estimate,</w:t>
+        </w:rPr>
+        <w:t xml:space="preserve"> moment estimate</w:t>
       </w:r>
     </w:p>
     <w:p>
@@ -3505,7 +3251,6 @@
           <w:rFonts w:ascii="Computer modern" w:hAnsi="Computer modern"/>
           <w:sz w:val="26"/>
           <w:szCs w:val="28"/>
-          <w:lang/>
         </w:rPr>
       </w:pPr>
       <m:oMathPara>
@@ -3518,7 +3263,6 @@
                   <w:i/>
                   <w:sz w:val="26"/>
                   <w:szCs w:val="28"/>
-                  <w:lang/>
                 </w:rPr>
               </m:ctrlPr>
             </m:sSubPr>
@@ -3531,7 +3275,6 @@
                       <w:i/>
                       <w:sz w:val="26"/>
                       <w:szCs w:val="28"/>
-                      <w:lang/>
                     </w:rPr>
                   </m:ctrlPr>
                 </m:accPr>
@@ -3541,7 +3284,6 @@
                       <w:rFonts w:ascii="Cambria Math" w:hAnsi="Cambria Math"/>
                       <w:sz w:val="26"/>
                       <w:szCs w:val="28"/>
-                      <w:lang/>
                     </w:rPr>
                     <m:t>v</m:t>
                   </m:r>
@@ -3554,7 +3296,6 @@
                   <w:rFonts w:ascii="Cambria Math" w:hAnsi="Cambria Math"/>
                   <w:sz w:val="26"/>
                   <w:szCs w:val="28"/>
-                  <w:lang/>
                 </w:rPr>
                 <m:t>t</m:t>
               </m:r>
@@ -3568,7 +3309,6 @@
               <w:rFonts w:ascii="Cambria Math" w:hAnsi="Cambria Math"/>
               <w:sz w:val="26"/>
               <w:szCs w:val="28"/>
-              <w:lang/>
             </w:rPr>
             <m:t xml:space="preserve">= </m:t>
           </m:r>
@@ -3580,7 +3320,6 @@
                   <w:i/>
                   <w:sz w:val="26"/>
                   <w:szCs w:val="28"/>
-                  <w:lang/>
                 </w:rPr>
               </m:ctrlPr>
             </m:fPr>
@@ -3593,7 +3332,6 @@
                       <w:i/>
                       <w:sz w:val="26"/>
                       <w:szCs w:val="28"/>
-                      <w:lang/>
                     </w:rPr>
                   </m:ctrlPr>
                 </m:sSubPr>
@@ -3603,7 +3341,6 @@
                       <w:rFonts w:ascii="Cambria Math" w:hAnsi="Cambria Math"/>
                       <w:sz w:val="26"/>
                       <w:szCs w:val="28"/>
-                      <w:lang/>
                     </w:rPr>
                     <m:t>v</m:t>
                   </m:r>
@@ -3614,7 +3351,6 @@
                       <w:rFonts w:ascii="Cambria Math" w:hAnsi="Cambria Math"/>
                       <w:sz w:val="26"/>
                       <w:szCs w:val="28"/>
-                      <w:lang/>
                     </w:rPr>
                     <m:t>t</m:t>
                   </m:r>
@@ -3630,7 +3366,6 @@
                   <w:rFonts w:ascii="Cambria Math" w:hAnsi="Cambria Math"/>
                   <w:sz w:val="26"/>
                   <w:szCs w:val="28"/>
-                  <w:lang/>
                 </w:rPr>
                 <m:t>(1-</m:t>
               </m:r>
@@ -3642,7 +3377,6 @@
                       <w:i/>
                       <w:sz w:val="26"/>
                       <w:szCs w:val="28"/>
-                      <w:lang/>
                     </w:rPr>
                   </m:ctrlPr>
                 </m:sSubSupPr>
@@ -3652,7 +3386,6 @@
                       <w:rFonts w:ascii="Cambria Math" w:hAnsi="Cambria Math"/>
                       <w:sz w:val="26"/>
                       <w:szCs w:val="28"/>
-                      <w:lang/>
                     </w:rPr>
                     <m:t>β</m:t>
                   </m:r>
@@ -3663,7 +3396,6 @@
                       <w:rFonts w:ascii="Cambria Math" w:hAnsi="Cambria Math"/>
                       <w:sz w:val="26"/>
                       <w:szCs w:val="28"/>
-                      <w:lang/>
                     </w:rPr>
                     <m:t>2</m:t>
                   </m:r>
@@ -3674,7 +3406,6 @@
                       <w:rFonts w:ascii="Cambria Math" w:hAnsi="Cambria Math"/>
                       <w:sz w:val="26"/>
                       <w:szCs w:val="28"/>
-                      <w:lang/>
                     </w:rPr>
                     <m:t>t</m:t>
                   </m:r>
@@ -3688,7 +3419,6 @@
                   <w:rFonts w:ascii="Cambria Math" w:hAnsi="Cambria Math"/>
                   <w:sz w:val="26"/>
                   <w:szCs w:val="28"/>
-                  <w:lang/>
                 </w:rPr>
                 <m:t>)</m:t>
               </m:r>
@@ -3731,7 +3461,6 @@
                 <w:i/>
                 <w:sz w:val="26"/>
                 <w:szCs w:val="28"/>
-                <w:lang/>
               </w:rPr>
             </m:ctrlPr>
           </m:sSubPr>
@@ -3741,7 +3470,6 @@
                 <w:rFonts w:ascii="Cambria Math" w:hAnsi="Cambria Math"/>
                 <w:sz w:val="26"/>
                 <w:szCs w:val="28"/>
-                <w:lang/>
               </w:rPr>
               <m:t>β</m:t>
             </m:r>
@@ -3752,7 +3480,6 @@
                 <w:rFonts w:ascii="Cambria Math" w:hAnsi="Cambria Math"/>
                 <w:sz w:val="26"/>
                 <w:szCs w:val="28"/>
-                <w:lang/>
               </w:rPr>
               <m:t>1</m:t>
             </m:r>
@@ -3784,7 +3511,6 @@
                 <w:i/>
                 <w:sz w:val="26"/>
                 <w:szCs w:val="28"/>
-                <w:lang/>
               </w:rPr>
             </m:ctrlPr>
           </m:sSubPr>
@@ -3794,7 +3520,6 @@
                 <w:rFonts w:ascii="Cambria Math" w:hAnsi="Cambria Math"/>
                 <w:sz w:val="26"/>
                 <w:szCs w:val="28"/>
-                <w:lang/>
               </w:rPr>
               <m:t>β</m:t>
             </m:r>
@@ -3805,7 +3530,6 @@
                 <w:rFonts w:ascii="Cambria Math" w:hAnsi="Cambria Math"/>
                 <w:sz w:val="26"/>
                 <w:szCs w:val="28"/>
-                <w:lang/>
               </w:rPr>
               <m:t>2</m:t>
             </m:r>
@@ -3826,7 +3550,31 @@
           <w:sz w:val="26"/>
           <w:szCs w:val="28"/>
         </w:rPr>
-        <w:t xml:space="preserve"> As the </w:t>
+        <w:t xml:space="preserve"> </w:t>
+      </w:r>
+      <w:r>
+        <w:rPr>
+          <w:rFonts w:ascii="Computer modern" w:hAnsi="Computer modern"/>
+          <w:sz w:val="26"/>
+          <w:szCs w:val="28"/>
+        </w:rPr>
+        <w:t>Without it, Adam would be very sluggish at the start. With it, the effective step size stays consistent from step one.</w:t>
+      </w:r>
+      <w:r>
+        <w:rPr>
+          <w:rFonts w:ascii="Computer modern" w:hAnsi="Computer modern"/>
+          <w:sz w:val="26"/>
+          <w:szCs w:val="28"/>
+        </w:rPr>
+        <w:t xml:space="preserve"> </w:t>
+      </w:r>
+      <w:r>
+        <w:rPr>
+          <w:rFonts w:ascii="Computer modern" w:hAnsi="Computer modern"/>
+          <w:sz w:val="26"/>
+          <w:szCs w:val="28"/>
+        </w:rPr>
+        <w:t xml:space="preserve">As the </w:t>
       </w:r>
       <w:r>
         <w:rPr>
@@ -3879,17 +3627,15 @@
           <w:rFonts w:ascii="Computer modern" w:hAnsi="Computer modern"/>
           <w:sz w:val="26"/>
           <w:szCs w:val="28"/>
-          <w:lang/>
-        </w:rPr>
-      </w:pPr>
-      <w:r>
-        <w:rPr>
-          <w:rFonts w:ascii="Computer modern" w:hAnsi="Computer modern"/>
-          <w:sz w:val="26"/>
-          <w:szCs w:val="28"/>
-          <w:lang/>
-        </w:rPr>
-        <w:t>Update parameters,</w:t>
+        </w:rPr>
+      </w:pPr>
+      <w:r>
+        <w:rPr>
+          <w:rFonts w:ascii="Computer modern" w:hAnsi="Computer modern"/>
+          <w:sz w:val="26"/>
+          <w:szCs w:val="28"/>
+        </w:rPr>
+        <w:t>Update parameters</w:t>
       </w:r>
     </w:p>
     <w:p>
@@ -3899,7 +3645,6 @@
           <w:rFonts w:ascii="Computer modern" w:eastAsiaTheme="minorEastAsia" w:hAnsi="Computer modern"/>
           <w:sz w:val="26"/>
           <w:szCs w:val="28"/>
-          <w:lang/>
         </w:rPr>
       </w:pPr>
       <m:oMathPara>
@@ -3911,7 +3656,6 @@
                   <w:rFonts w:ascii="Cambria Math" w:hAnsi="Cambria Math"/>
                   <w:sz w:val="26"/>
                   <w:szCs w:val="28"/>
-                  <w:lang/>
                 </w:rPr>
               </m:ctrlPr>
             </m:sSubPr>
@@ -3924,7 +3668,6 @@
                   <w:rFonts w:ascii="Cambria Math" w:hAnsi="Cambria Math"/>
                   <w:sz w:val="26"/>
                   <w:szCs w:val="28"/>
-                  <w:lang/>
                 </w:rPr>
                 <m:t>θ</m:t>
               </m:r>
@@ -3938,7 +3681,6 @@
                   <w:rFonts w:ascii="Cambria Math" w:hAnsi="Cambria Math"/>
                   <w:sz w:val="26"/>
                   <w:szCs w:val="28"/>
-                  <w:lang/>
                 </w:rPr>
                 <m:t>t</m:t>
               </m:r>
@@ -3952,7 +3694,6 @@
               <w:rFonts w:ascii="Cambria Math" w:hAnsi="Cambria Math"/>
               <w:sz w:val="26"/>
               <w:szCs w:val="28"/>
-              <w:lang/>
             </w:rPr>
             <m:t xml:space="preserve">= </m:t>
           </m:r>
@@ -3963,7 +3704,6 @@
                   <w:rFonts w:ascii="Cambria Math" w:hAnsi="Cambria Math"/>
                   <w:sz w:val="26"/>
                   <w:szCs w:val="28"/>
-                  <w:lang/>
                 </w:rPr>
               </m:ctrlPr>
             </m:sSubPr>
@@ -3976,7 +3716,6 @@
                   <w:rFonts w:ascii="Cambria Math" w:hAnsi="Cambria Math"/>
                   <w:sz w:val="26"/>
                   <w:szCs w:val="28"/>
-                  <w:lang/>
                 </w:rPr>
                 <m:t>θ</m:t>
               </m:r>
@@ -3990,7 +3729,6 @@
                   <w:rFonts w:ascii="Cambria Math" w:hAnsi="Cambria Math"/>
                   <w:sz w:val="26"/>
                   <w:szCs w:val="28"/>
-                  <w:lang/>
                 </w:rPr>
                 <m:t>t-1</m:t>
               </m:r>
@@ -4004,7 +3742,6 @@
               <w:rFonts w:ascii="Cambria Math" w:hAnsi="Cambria Math"/>
               <w:sz w:val="26"/>
               <w:szCs w:val="28"/>
-              <w:lang/>
             </w:rPr>
             <m:t xml:space="preserve"> - </m:t>
           </m:r>
@@ -4015,7 +3752,6 @@
                   <w:rFonts w:ascii="Cambria Math" w:hAnsi="Cambria Math"/>
                   <w:sz w:val="26"/>
                   <w:szCs w:val="28"/>
-                  <w:lang/>
                 </w:rPr>
               </m:ctrlPr>
             </m:fPr>
@@ -4028,7 +3764,6 @@
                   <w:rFonts w:ascii="Cambria Math" w:hAnsi="Cambria Math"/>
                   <w:sz w:val="26"/>
                   <w:szCs w:val="28"/>
-                  <w:lang/>
                 </w:rPr>
                 <m:t xml:space="preserve">α · </m:t>
               </m:r>
@@ -4040,7 +3775,6 @@
                       <w:i/>
                       <w:sz w:val="26"/>
                       <w:szCs w:val="28"/>
-                      <w:lang/>
                     </w:rPr>
                   </m:ctrlPr>
                 </m:sSubPr>
@@ -4053,7 +3787,6 @@
                           <w:i/>
                           <w:sz w:val="26"/>
                           <w:szCs w:val="28"/>
-                          <w:lang/>
                         </w:rPr>
                       </m:ctrlPr>
                     </m:accPr>
@@ -4063,7 +3796,6 @@
                           <w:rFonts w:ascii="Cambria Math" w:hAnsi="Cambria Math"/>
                           <w:sz w:val="26"/>
                           <w:szCs w:val="28"/>
-                          <w:lang/>
                         </w:rPr>
                         <m:t>m</m:t>
                       </m:r>
@@ -4076,7 +3808,6 @@
                       <w:rFonts w:ascii="Cambria Math" w:hAnsi="Cambria Math"/>
                       <w:sz w:val="26"/>
                       <w:szCs w:val="28"/>
-                      <w:lang/>
                     </w:rPr>
                     <m:t>t</m:t>
                   </m:r>
@@ -4090,7 +3821,6 @@
                   <w:rFonts w:ascii="Cambria Math" w:hAnsi="Cambria Math"/>
                   <w:sz w:val="26"/>
                   <w:szCs w:val="28"/>
-                  <w:lang/>
                 </w:rPr>
                 <m:t xml:space="preserve"> </m:t>
               </m:r>
@@ -4104,7 +3834,6 @@
                   <w:rFonts w:ascii="Cambria Math" w:hAnsi="Cambria Math"/>
                   <w:sz w:val="26"/>
                   <w:szCs w:val="28"/>
-                  <w:lang/>
                 </w:rPr>
                 <m:t>(</m:t>
               </m:r>
@@ -4117,7 +3846,6 @@
                       <w:i/>
                       <w:sz w:val="26"/>
                       <w:szCs w:val="28"/>
-                      <w:lang/>
                     </w:rPr>
                   </m:ctrlPr>
                 </m:radPr>
@@ -4131,7 +3859,6 @@
                           <w:i/>
                           <w:sz w:val="26"/>
                           <w:szCs w:val="28"/>
-                          <w:lang/>
                         </w:rPr>
                       </m:ctrlPr>
                     </m:sSubPr>
@@ -4144,7 +3871,6 @@
                               <w:i/>
                               <w:sz w:val="26"/>
                               <w:szCs w:val="28"/>
-                              <w:lang/>
                             </w:rPr>
                           </m:ctrlPr>
                         </m:accPr>
@@ -4154,7 +3880,6 @@
                               <w:rFonts w:ascii="Cambria Math" w:hAnsi="Cambria Math"/>
                               <w:sz w:val="26"/>
                               <w:szCs w:val="28"/>
-                              <w:lang/>
                             </w:rPr>
                             <m:t>v</m:t>
                           </m:r>
@@ -4167,7 +3892,6 @@
                           <w:rFonts w:ascii="Cambria Math" w:hAnsi="Cambria Math"/>
                           <w:sz w:val="26"/>
                           <w:szCs w:val="28"/>
-                          <w:lang/>
                         </w:rPr>
                         <m:t>t</m:t>
                       </m:r>
@@ -4183,7 +3907,6 @@
                   <w:rFonts w:ascii="Cambria Math" w:hAnsi="Cambria Math"/>
                   <w:sz w:val="26"/>
                   <w:szCs w:val="28"/>
-                  <w:lang/>
                 </w:rPr>
                 <m:t xml:space="preserve"> + ε)</m:t>
               </m:r>
@@ -4228,7 +3951,6 @@
                 <w:i/>
                 <w:sz w:val="26"/>
                 <w:szCs w:val="28"/>
-                <w:lang/>
               </w:rPr>
             </m:ctrlPr>
           </m:radPr>
@@ -4242,7 +3964,6 @@
                     <w:i/>
                     <w:sz w:val="26"/>
                     <w:szCs w:val="28"/>
-                    <w:lang/>
                   </w:rPr>
                 </m:ctrlPr>
               </m:sSubPr>
@@ -4255,7 +3976,6 @@
                         <w:i/>
                         <w:sz w:val="26"/>
                         <w:szCs w:val="28"/>
-                        <w:lang/>
                       </w:rPr>
                     </m:ctrlPr>
                   </m:accPr>
@@ -4265,7 +3985,6 @@
                         <w:rFonts w:ascii="Cambria Math" w:hAnsi="Cambria Math"/>
                         <w:sz w:val="26"/>
                         <w:szCs w:val="28"/>
-                        <w:lang/>
                       </w:rPr>
                       <m:t>v</m:t>
                     </m:r>
@@ -4278,7 +3997,6 @@
                     <w:rFonts w:ascii="Cambria Math" w:hAnsi="Cambria Math"/>
                     <w:sz w:val="26"/>
                     <w:szCs w:val="28"/>
-                    <w:lang/>
                   </w:rPr>
                   <m:t>t</m:t>
                 </m:r>
@@ -4291,7 +4009,6 @@
             <w:rFonts w:ascii="Cambria Math" w:hAnsi="Cambria Math"/>
             <w:sz w:val="26"/>
             <w:szCs w:val="28"/>
-            <w:lang/>
           </w:rPr>
           <m:t>)</m:t>
         </m:r>
@@ -4301,7 +4018,6 @@
           <w:rFonts w:ascii="Computer modern" w:eastAsiaTheme="minorEastAsia" w:hAnsi="Computer modern"/>
           <w:sz w:val="26"/>
           <w:szCs w:val="28"/>
-          <w:lang/>
         </w:rPr>
         <w:t xml:space="preserve"> </w:t>
       </w:r>
@@ -4345,7 +4061,6 @@
           <w:rFonts w:ascii="Computer modern" w:eastAsiaTheme="minorEastAsia" w:hAnsi="Computer modern"/>
           <w:sz w:val="26"/>
           <w:szCs w:val="28"/>
-          <w:lang/>
         </w:rPr>
         <w:t xml:space="preserve">Improvement </w:t>
       </w:r>
@@ -4354,7 +4069,6 @@
           <w:rFonts w:ascii="Computer modern" w:eastAsiaTheme="minorEastAsia" w:hAnsi="Computer modern"/>
           <w:sz w:val="26"/>
           <w:szCs w:val="28"/>
-          <w:lang/>
         </w:rPr>
         <w:t>possibility</w:t>
       </w:r>
@@ -4363,7 +4077,6 @@
           <w:rFonts w:ascii="Computer modern" w:eastAsiaTheme="minorEastAsia" w:hAnsi="Computer modern"/>
           <w:sz w:val="26"/>
           <w:szCs w:val="28"/>
-          <w:lang/>
         </w:rPr>
         <w:t>!</w:t>
       </w:r>
@@ -4380,7 +4093,6 @@
           <w:sz w:val="26"/>
           <w:szCs w:val="28"/>
           <w:highlight w:val="yellow"/>
-          <w:lang/>
         </w:rPr>
       </w:pPr>
       <w:r>
@@ -4388,16 +4100,33 @@
           <w:rFonts w:ascii="Computer modern" w:eastAsiaTheme="minorEastAsia" w:hAnsi="Computer modern"/>
           <w:sz w:val="26"/>
           <w:szCs w:val="28"/>
-          <w:lang/>
-        </w:rPr>
-        <w:t>Note that the efficiency of algorithm can</w:t>
-      </w:r>
+        </w:rPr>
+        <w:t xml:space="preserve">Note that the efficiency of </w:t>
+      </w:r>
+      <w:proofErr w:type="gramStart"/>
       <w:r>
         <w:rPr>
           <w:rFonts w:ascii="Computer modern" w:eastAsiaTheme="minorEastAsia" w:hAnsi="Computer modern"/>
           <w:sz w:val="26"/>
           <w:szCs w:val="28"/>
         </w:rPr>
+        <w:t>algorithm</w:t>
+      </w:r>
+      <w:proofErr w:type="gramEnd"/>
+      <w:r>
+        <w:rPr>
+          <w:rFonts w:ascii="Computer modern" w:eastAsiaTheme="minorEastAsia" w:hAnsi="Computer modern"/>
+          <w:sz w:val="26"/>
+          <w:szCs w:val="28"/>
+        </w:rPr>
+        <w:t xml:space="preserve"> can</w:t>
+      </w:r>
+      <w:r>
+        <w:rPr>
+          <w:rFonts w:ascii="Computer modern" w:eastAsiaTheme="minorEastAsia" w:hAnsi="Computer modern"/>
+          <w:sz w:val="26"/>
+          <w:szCs w:val="28"/>
+        </w:rPr>
         <w:t xml:space="preserve"> </w:t>
       </w:r>
       <w:r>
@@ -4405,7 +4134,6 @@
           <w:rFonts w:ascii="Computer modern" w:eastAsiaTheme="minorEastAsia" w:hAnsi="Computer modern"/>
           <w:sz w:val="26"/>
           <w:szCs w:val="28"/>
-          <w:lang/>
         </w:rPr>
         <w:t>be improved upon by changing</w:t>
       </w:r>
@@ -4414,7 +4142,6 @@
           <w:rFonts w:ascii="Computer modern" w:eastAsiaTheme="minorEastAsia" w:hAnsi="Computer modern"/>
           <w:sz w:val="26"/>
           <w:szCs w:val="28"/>
-          <w:lang/>
         </w:rPr>
         <w:t xml:space="preserve"> </w:t>
       </w:r>
@@ -4423,7 +4150,6 @@
           <w:rFonts w:ascii="Computer modern" w:eastAsiaTheme="minorEastAsia" w:hAnsi="Computer modern"/>
           <w:sz w:val="26"/>
           <w:szCs w:val="28"/>
-          <w:lang/>
         </w:rPr>
         <w:t>the order of computation,</w:t>
       </w:r>
@@ -4440,7 +4166,6 @@
           <w:rFonts w:ascii="Computer modern" w:eastAsiaTheme="minorEastAsia" w:hAnsi="Computer modern"/>
           <w:sz w:val="26"/>
           <w:szCs w:val="28"/>
-          <w:lang/>
         </w:rPr>
         <w:t xml:space="preserve"> </w:t>
       </w:r>
@@ -4450,7 +4175,6 @@
           <w:sz w:val="26"/>
           <w:szCs w:val="28"/>
           <w:highlight w:val="yellow"/>
-          <w:lang/>
         </w:rPr>
         <w:t>e.g. by replacing the last three lines in the loop with the following lines:</w:t>
       </w:r>
@@ -4472,7 +4196,6 @@
           <w:i/>
           <w:sz w:val="26"/>
           <w:szCs w:val="28"/>
-          <w:lang/>
         </w:rPr>
         <w:br/>
       </w:r>
@@ -4485,7 +4208,6 @@
                   <w:rFonts w:ascii="Cambria Math" w:hAnsi="Cambria Math"/>
                   <w:sz w:val="26"/>
                   <w:szCs w:val="28"/>
-                  <w:lang/>
                 </w:rPr>
               </m:ctrlPr>
             </m:sSubPr>
@@ -4498,7 +4220,6 @@
                   <w:rFonts w:ascii="Cambria Math" w:eastAsiaTheme="minorEastAsia" w:hAnsi="Cambria Math"/>
                   <w:sz w:val="26"/>
                   <w:szCs w:val="28"/>
-                  <w:lang/>
                 </w:rPr>
                 <m:t>α</m:t>
               </m:r>
@@ -4512,7 +4233,6 @@
                   <w:rFonts w:ascii="Cambria Math" w:hAnsi="Cambria Math"/>
                   <w:sz w:val="26"/>
                   <w:szCs w:val="28"/>
-                  <w:lang/>
                 </w:rPr>
                 <m:t>t</m:t>
               </m:r>
@@ -4526,7 +4246,6 @@
               <w:rFonts w:ascii="Cambria Math" w:eastAsiaTheme="minorEastAsia" w:hAnsi="Cambria Math"/>
               <w:sz w:val="26"/>
               <w:szCs w:val="28"/>
-              <w:lang/>
             </w:rPr>
             <m:t xml:space="preserve">= </m:t>
           </m:r>
@@ -4537,7 +4256,6 @@
                   <w:rFonts w:ascii="Cambria Math" w:eastAsiaTheme="minorEastAsia" w:hAnsi="Cambria Math"/>
                   <w:sz w:val="26"/>
                   <w:szCs w:val="28"/>
-                  <w:lang/>
                 </w:rPr>
               </m:ctrlPr>
             </m:fPr>
@@ -4550,7 +4268,6 @@
                   <w:rFonts w:ascii="Cambria Math" w:eastAsiaTheme="minorEastAsia" w:hAnsi="Cambria Math"/>
                   <w:sz w:val="26"/>
                   <w:szCs w:val="28"/>
-                  <w:lang/>
                 </w:rPr>
                 <m:t xml:space="preserve">α · </m:t>
               </m:r>
@@ -4562,7 +4279,6 @@
                       <w:rFonts w:ascii="Cambria Math" w:eastAsiaTheme="minorEastAsia" w:hAnsi="Cambria Math"/>
                       <w:sz w:val="26"/>
                       <w:szCs w:val="28"/>
-                      <w:lang/>
                     </w:rPr>
                   </m:ctrlPr>
                 </m:radPr>
@@ -4576,7 +4292,6 @@
                       <w:rFonts w:ascii="Cambria Math" w:eastAsiaTheme="minorEastAsia" w:hAnsi="Cambria Math"/>
                       <w:sz w:val="26"/>
                       <w:szCs w:val="28"/>
-                      <w:lang/>
                     </w:rPr>
                     <m:t xml:space="preserve">1 - </m:t>
                   </m:r>
@@ -4588,7 +4303,6 @@
                           <w:i/>
                           <w:sz w:val="26"/>
                           <w:szCs w:val="28"/>
-                          <w:lang/>
                         </w:rPr>
                       </m:ctrlPr>
                     </m:sSubSupPr>
@@ -4598,7 +4312,6 @@
                           <w:rFonts w:ascii="Cambria Math" w:hAnsi="Cambria Math"/>
                           <w:sz w:val="26"/>
                           <w:szCs w:val="28"/>
-                          <w:lang/>
                         </w:rPr>
                         <m:t>β</m:t>
                       </m:r>
@@ -4609,7 +4322,6 @@
                           <w:rFonts w:ascii="Cambria Math" w:hAnsi="Cambria Math"/>
                           <w:sz w:val="26"/>
                           <w:szCs w:val="28"/>
-                          <w:lang/>
                         </w:rPr>
                         <m:t>2</m:t>
                       </m:r>
@@ -4620,7 +4332,6 @@
                           <w:rFonts w:ascii="Cambria Math" w:hAnsi="Cambria Math"/>
                           <w:sz w:val="26"/>
                           <w:szCs w:val="28"/>
-                          <w:lang/>
                         </w:rPr>
                         <m:t>t</m:t>
                       </m:r>
@@ -4638,7 +4349,6 @@
                   <w:rFonts w:ascii="Cambria Math" w:hAnsi="Cambria Math"/>
                   <w:sz w:val="26"/>
                   <w:szCs w:val="28"/>
-                  <w:lang/>
                 </w:rPr>
                 <m:t>(1-</m:t>
               </m:r>
@@ -4650,7 +4360,6 @@
                       <w:i/>
                       <w:sz w:val="26"/>
                       <w:szCs w:val="28"/>
-                      <w:lang/>
                     </w:rPr>
                   </m:ctrlPr>
                 </m:sSubSupPr>
@@ -4660,7 +4369,6 @@
                       <w:rFonts w:ascii="Cambria Math" w:hAnsi="Cambria Math"/>
                       <w:sz w:val="26"/>
                       <w:szCs w:val="28"/>
-                      <w:lang/>
                     </w:rPr>
                     <m:t>β</m:t>
                   </m:r>
@@ -4671,7 +4379,6 @@
                       <w:rFonts w:ascii="Cambria Math" w:hAnsi="Cambria Math"/>
                       <w:sz w:val="26"/>
                       <w:szCs w:val="28"/>
-                      <w:lang/>
                     </w:rPr>
                     <m:t>1</m:t>
                   </m:r>
@@ -4682,7 +4389,6 @@
                       <w:rFonts w:ascii="Cambria Math" w:hAnsi="Cambria Math"/>
                       <w:sz w:val="26"/>
                       <w:szCs w:val="28"/>
-                      <w:lang/>
                     </w:rPr>
                     <m:t>t</m:t>
                   </m:r>
@@ -4696,7 +4402,6 @@
                   <w:rFonts w:ascii="Cambria Math" w:hAnsi="Cambria Math"/>
                   <w:sz w:val="26"/>
                   <w:szCs w:val="28"/>
-                  <w:lang/>
                 </w:rPr>
                 <m:t>)</m:t>
               </m:r>
@@ -4712,7 +4417,6 @@
           <w:rFonts w:ascii="Computer modern" w:eastAsiaTheme="minorEastAsia" w:hAnsi="Computer modern"/>
           <w:sz w:val="26"/>
           <w:szCs w:val="28"/>
-          <w:lang/>
         </w:rPr>
       </w:pPr>
       <m:oMathPara>
@@ -4724,7 +4428,6 @@
                   <w:rFonts w:ascii="Cambria Math" w:hAnsi="Cambria Math"/>
                   <w:sz w:val="26"/>
                   <w:szCs w:val="28"/>
-                  <w:lang/>
                 </w:rPr>
               </m:ctrlPr>
             </m:sSubPr>
@@ -4737,7 +4440,6 @@
                   <w:rFonts w:ascii="Cambria Math" w:hAnsi="Cambria Math"/>
                   <w:sz w:val="26"/>
                   <w:szCs w:val="28"/>
-                  <w:lang/>
                 </w:rPr>
                 <m:t>θ</m:t>
               </m:r>
@@ -4751,7 +4453,6 @@
                   <w:rFonts w:ascii="Cambria Math" w:hAnsi="Cambria Math"/>
                   <w:sz w:val="26"/>
                   <w:szCs w:val="28"/>
-                  <w:lang/>
                 </w:rPr>
                 <m:t>t</m:t>
               </m:r>
@@ -4765,7 +4466,6 @@
               <w:rFonts w:ascii="Cambria Math" w:hAnsi="Cambria Math"/>
               <w:sz w:val="26"/>
               <w:szCs w:val="28"/>
-              <w:lang/>
             </w:rPr>
             <m:t xml:space="preserve">= </m:t>
           </m:r>
@@ -4776,7 +4476,6 @@
                   <w:rFonts w:ascii="Cambria Math" w:hAnsi="Cambria Math"/>
                   <w:sz w:val="26"/>
                   <w:szCs w:val="28"/>
-                  <w:lang/>
                 </w:rPr>
               </m:ctrlPr>
             </m:sSubPr>
@@ -4789,7 +4488,6 @@
                   <w:rFonts w:ascii="Cambria Math" w:hAnsi="Cambria Math"/>
                   <w:sz w:val="26"/>
                   <w:szCs w:val="28"/>
-                  <w:lang/>
                 </w:rPr>
                 <m:t>θ</m:t>
               </m:r>
@@ -4803,7 +4501,6 @@
                   <w:rFonts w:ascii="Cambria Math" w:hAnsi="Cambria Math"/>
                   <w:sz w:val="26"/>
                   <w:szCs w:val="28"/>
-                  <w:lang/>
                 </w:rPr>
                 <m:t>t-1</m:t>
               </m:r>
@@ -4817,7 +4514,6 @@
               <w:rFonts w:ascii="Cambria Math" w:hAnsi="Cambria Math"/>
               <w:sz w:val="26"/>
               <w:szCs w:val="28"/>
-              <w:lang/>
             </w:rPr>
             <m:t xml:space="preserve"> - </m:t>
           </m:r>
@@ -4828,7 +4524,6 @@
                   <w:rFonts w:ascii="Cambria Math" w:hAnsi="Cambria Math"/>
                   <w:sz w:val="26"/>
                   <w:szCs w:val="28"/>
-                  <w:lang/>
                 </w:rPr>
               </m:ctrlPr>
             </m:fPr>
@@ -4840,7 +4535,6 @@
                       <w:rFonts w:ascii="Cambria Math" w:hAnsi="Cambria Math"/>
                       <w:sz w:val="26"/>
                       <w:szCs w:val="28"/>
-                      <w:lang/>
                     </w:rPr>
                   </m:ctrlPr>
                 </m:sSubPr>
@@ -4853,7 +4547,6 @@
                       <w:rFonts w:ascii="Cambria Math" w:hAnsi="Cambria Math"/>
                       <w:sz w:val="26"/>
                       <w:szCs w:val="28"/>
-                      <w:lang/>
                     </w:rPr>
                     <m:t>α</m:t>
                   </m:r>
@@ -4864,7 +4557,6 @@
                       <w:rFonts w:ascii="Cambria Math" w:hAnsi="Cambria Math"/>
                       <w:sz w:val="26"/>
                       <w:szCs w:val="28"/>
-                      <w:lang/>
                     </w:rPr>
                     <m:t>t</m:t>
                   </m:r>
@@ -4878,7 +4570,6 @@
                   <w:rFonts w:ascii="Cambria Math" w:hAnsi="Cambria Math"/>
                   <w:sz w:val="26"/>
                   <w:szCs w:val="28"/>
-                  <w:lang/>
                 </w:rPr>
                 <m:t xml:space="preserve"> · </m:t>
               </m:r>
@@ -4890,7 +4581,6 @@
                       <w:i/>
                       <w:sz w:val="26"/>
                       <w:szCs w:val="28"/>
-                      <w:lang/>
                     </w:rPr>
                   </m:ctrlPr>
                 </m:sSubPr>
@@ -4903,7 +4593,6 @@
                           <w:i/>
                           <w:sz w:val="26"/>
                           <w:szCs w:val="28"/>
-                          <w:lang/>
                         </w:rPr>
                       </m:ctrlPr>
                     </m:accPr>
@@ -4913,7 +4602,6 @@
                           <w:rFonts w:ascii="Cambria Math" w:hAnsi="Cambria Math"/>
                           <w:sz w:val="26"/>
                           <w:szCs w:val="28"/>
-                          <w:lang/>
                         </w:rPr>
                         <m:t>m</m:t>
                       </m:r>
@@ -4926,7 +4614,6 @@
                       <w:rFonts w:ascii="Cambria Math" w:hAnsi="Cambria Math"/>
                       <w:sz w:val="26"/>
                       <w:szCs w:val="28"/>
-                      <w:lang/>
                     </w:rPr>
                     <m:t>t</m:t>
                   </m:r>
@@ -4940,7 +4627,6 @@
                   <w:rFonts w:ascii="Cambria Math" w:hAnsi="Cambria Math"/>
                   <w:sz w:val="26"/>
                   <w:szCs w:val="28"/>
-                  <w:lang/>
                 </w:rPr>
                 <m:t xml:space="preserve"> </m:t>
               </m:r>
@@ -4954,7 +4640,6 @@
                   <w:rFonts w:ascii="Cambria Math" w:hAnsi="Cambria Math"/>
                   <w:sz w:val="26"/>
                   <w:szCs w:val="28"/>
-                  <w:lang/>
                 </w:rPr>
                 <m:t>(</m:t>
               </m:r>
@@ -4967,7 +4652,6 @@
                       <w:i/>
                       <w:sz w:val="26"/>
                       <w:szCs w:val="28"/>
-                      <w:lang/>
                     </w:rPr>
                   </m:ctrlPr>
                 </m:radPr>
@@ -4981,7 +4665,6 @@
                           <w:i/>
                           <w:sz w:val="26"/>
                           <w:szCs w:val="28"/>
-                          <w:lang/>
                         </w:rPr>
                       </m:ctrlPr>
                     </m:sSubPr>
@@ -4991,7 +4674,6 @@
                           <w:rFonts w:ascii="Cambria Math" w:hAnsi="Cambria Math"/>
                           <w:sz w:val="26"/>
                           <w:szCs w:val="28"/>
-                          <w:lang/>
                         </w:rPr>
                         <m:t>v</m:t>
                       </m:r>
@@ -5002,7 +4684,6 @@
                           <w:rFonts w:ascii="Cambria Math" w:hAnsi="Cambria Math"/>
                           <w:sz w:val="26"/>
                           <w:szCs w:val="28"/>
-                          <w:lang/>
                         </w:rPr>
                         <m:t>t</m:t>
                       </m:r>
@@ -5018,7 +4699,6 @@
                   <w:rFonts w:ascii="Cambria Math" w:hAnsi="Cambria Math"/>
                   <w:sz w:val="26"/>
                   <w:szCs w:val="28"/>
-                  <w:lang/>
                 </w:rPr>
                 <m:t xml:space="preserve"> + </m:t>
               </m:r>
@@ -5029,7 +4709,6 @@
                       <w:rFonts w:ascii="Cambria Math" w:hAnsi="Cambria Math"/>
                       <w:sz w:val="26"/>
                       <w:szCs w:val="28"/>
-                      <w:lang/>
                     </w:rPr>
                   </m:ctrlPr>
                 </m:accPr>
@@ -5042,7 +4721,6 @@
                       <w:rFonts w:ascii="Cambria Math" w:hAnsi="Cambria Math"/>
                       <w:sz w:val="26"/>
                       <w:szCs w:val="28"/>
-                      <w:lang/>
                     </w:rPr>
                     <m:t>ε</m:t>
                   </m:r>
@@ -5056,7 +4734,6 @@
                   <w:rFonts w:ascii="Cambria Math" w:hAnsi="Cambria Math"/>
                   <w:sz w:val="26"/>
                   <w:szCs w:val="28"/>
-                  <w:lang/>
                 </w:rPr>
                 <m:t>)</m:t>
               </m:r>
@@ -5073,7 +4750,6 @@
           <w:rFonts w:ascii="Computer modern" w:eastAsiaTheme="minorEastAsia" w:hAnsi="Computer modern"/>
           <w:sz w:val="26"/>
           <w:szCs w:val="28"/>
-          <w:lang/>
         </w:rPr>
       </w:pPr>
       <w:r>
@@ -5081,7 +4757,6 @@
           <w:rFonts w:ascii="Computer modern" w:eastAsiaTheme="minorEastAsia" w:hAnsi="Computer modern"/>
           <w:sz w:val="26"/>
           <w:szCs w:val="28"/>
-          <w:lang/>
         </w:rPr>
         <w:t xml:space="preserve">This version saves execution time because the computer calculates a scalar factor </w:t>
       </w:r>
@@ -5093,7 +4768,6 @@
                 <w:rFonts w:ascii="Cambria Math" w:hAnsi="Cambria Math"/>
                 <w:sz w:val="26"/>
                 <w:szCs w:val="28"/>
-                <w:lang/>
               </w:rPr>
             </m:ctrlPr>
           </m:sSubPr>
@@ -5106,7 +4780,6 @@
                 <w:rFonts w:ascii="Cambria Math" w:eastAsiaTheme="minorEastAsia" w:hAnsi="Cambria Math"/>
                 <w:sz w:val="26"/>
                 <w:szCs w:val="28"/>
-                <w:lang/>
               </w:rPr>
               <m:t>α</m:t>
             </m:r>
@@ -5120,7 +4793,6 @@
                 <w:rFonts w:ascii="Cambria Math" w:hAnsi="Cambria Math"/>
                 <w:sz w:val="26"/>
                 <w:szCs w:val="28"/>
-                <w:lang/>
               </w:rPr>
               <m:t>t</m:t>
             </m:r>
@@ -5132,7 +4804,6 @@
           <w:rFonts w:ascii="Computer modern" w:eastAsiaTheme="minorEastAsia" w:hAnsi="Computer modern"/>
           <w:sz w:val="26"/>
           <w:szCs w:val="28"/>
-          <w:lang/>
         </w:rPr>
         <w:t xml:space="preserve"> </w:t>
       </w:r>
@@ -5141,7 +4812,6 @@
           <w:rFonts w:ascii="Computer modern" w:eastAsiaTheme="minorEastAsia" w:hAnsi="Computer modern"/>
           <w:sz w:val="26"/>
           <w:szCs w:val="28"/>
-          <w:lang/>
         </w:rPr>
         <w:t xml:space="preserve">first, rather than applying element-wise vector divisions to the momentum arrays </w:t>
       </w:r>
@@ -5153,7 +4823,6 @@
                 <w:rFonts w:ascii="Cambria Math" w:hAnsi="Cambria Math"/>
                 <w:sz w:val="26"/>
                 <w:szCs w:val="28"/>
-                <w:lang/>
               </w:rPr>
             </m:ctrlPr>
           </m:sSubPr>
@@ -5166,7 +4835,6 @@
                 <w:rFonts w:ascii="Cambria Math" w:eastAsiaTheme="minorEastAsia" w:hAnsi="Cambria Math"/>
                 <w:sz w:val="26"/>
                 <w:szCs w:val="28"/>
-                <w:lang/>
               </w:rPr>
               <m:t>m</m:t>
             </m:r>
@@ -5180,7 +4848,6 @@
                 <w:rFonts w:ascii="Cambria Math" w:hAnsi="Cambria Math"/>
                 <w:sz w:val="26"/>
                 <w:szCs w:val="28"/>
-                <w:lang/>
               </w:rPr>
               <m:t>t</m:t>
             </m:r>
@@ -5192,7 +4859,6 @@
           <w:rFonts w:ascii="Computer modern" w:eastAsiaTheme="minorEastAsia" w:hAnsi="Computer modern"/>
           <w:sz w:val="26"/>
           <w:szCs w:val="28"/>
-          <w:lang/>
         </w:rPr>
         <w:t xml:space="preserve"> and </w:t>
       </w:r>
@@ -5204,7 +4870,6 @@
                 <w:rFonts w:ascii="Cambria Math" w:hAnsi="Cambria Math"/>
                 <w:sz w:val="26"/>
                 <w:szCs w:val="28"/>
-                <w:lang/>
               </w:rPr>
             </m:ctrlPr>
           </m:sSubPr>
@@ -5217,7 +4882,6 @@
                 <w:rFonts w:ascii="Cambria Math" w:eastAsiaTheme="minorEastAsia" w:hAnsi="Cambria Math"/>
                 <w:sz w:val="26"/>
                 <w:szCs w:val="28"/>
-                <w:lang/>
               </w:rPr>
               <m:t>v</m:t>
             </m:r>
@@ -5231,7 +4895,6 @@
                 <w:rFonts w:ascii="Cambria Math" w:hAnsi="Cambria Math"/>
                 <w:sz w:val="26"/>
                 <w:szCs w:val="28"/>
-                <w:lang/>
               </w:rPr>
               <m:t>t</m:t>
             </m:r>
@@ -5243,7 +4906,6 @@
           <w:rFonts w:ascii="Computer modern" w:eastAsiaTheme="minorEastAsia" w:hAnsi="Computer modern"/>
           <w:sz w:val="26"/>
           <w:szCs w:val="28"/>
-          <w:lang/>
         </w:rPr>
         <w:t>.</w:t>
       </w:r>
@@ -5264,6 +4926,11 @@
     </w:p>
     <w:p>
       <w:pPr>
+        <w:pStyle w:val="ListParagraph"/>
+        <w:numPr>
+          <w:ilvl w:val="0"/>
+          <w:numId w:val="1"/>
+        </w:numPr>
         <w:spacing w:after="0"/>
         <w:jc w:val="both"/>
         <w:rPr>
@@ -5272,9 +4939,9 @@
           <w:bCs/>
           <w:sz w:val="26"/>
           <w:szCs w:val="28"/>
-          <w:highlight w:val="yellow"/>
-        </w:rPr>
-      </w:pPr>
+        </w:rPr>
+      </w:pPr>
+      <w:proofErr w:type="spellStart"/>
       <w:r>
         <w:rPr>
           <w:rFonts w:eastAsiaTheme="minorEastAsia"/>
@@ -5283,8 +4950,9 @@
           <w:sz w:val="26"/>
           <w:szCs w:val="28"/>
         </w:rPr>
-        <w:t>Compar</w:t>
-      </w:r>
+        <w:t>Matlab</w:t>
+      </w:r>
+      <w:proofErr w:type="spellEnd"/>
       <w:r>
         <w:rPr>
           <w:rFonts w:eastAsiaTheme="minorEastAsia"/>
@@ -5293,18 +4961,22 @@
           <w:sz w:val="26"/>
           <w:szCs w:val="28"/>
         </w:rPr>
-        <w:t>i</w:t>
-      </w:r>
-      <w:r>
+        <w:t xml:space="preserve"> Implementation</w:t>
+      </w:r>
+    </w:p>
+    <w:p>
+      <w:pPr>
+        <w:spacing w:after="0"/>
+        <w:jc w:val="both"/>
         <w:rPr>
           <w:rFonts w:eastAsiaTheme="minorEastAsia"/>
           <w:b/>
           <w:bCs/>
           <w:sz w:val="26"/>
           <w:szCs w:val="28"/>
-        </w:rPr>
-        <w:t>son</w:t>
-      </w:r>
+          <w:highlight w:val="yellow"/>
+        </w:rPr>
+      </w:pPr>
       <w:r>
         <w:rPr>
           <w:rFonts w:eastAsiaTheme="minorEastAsia"/>
@@ -5312,8 +4984,621 @@
           <w:bCs/>
           <w:sz w:val="26"/>
           <w:szCs w:val="28"/>
+          <w:highlight w:val="yellow"/>
+        </w:rPr>
+        <w:t xml:space="preserve">Insert </w:t>
+      </w:r>
+      <w:proofErr w:type="spellStart"/>
+      <w:r>
+        <w:rPr>
+          <w:rFonts w:eastAsiaTheme="minorEastAsia"/>
+          <w:b/>
+          <w:bCs/>
+          <w:sz w:val="26"/>
+          <w:szCs w:val="28"/>
+          <w:highlight w:val="yellow"/>
+        </w:rPr>
+        <w:t>Matlab</w:t>
+      </w:r>
+      <w:proofErr w:type="spellEnd"/>
+      <w:r>
+        <w:rPr>
+          <w:rFonts w:eastAsiaTheme="minorEastAsia"/>
+          <w:b/>
+          <w:bCs/>
+          <w:sz w:val="26"/>
+          <w:szCs w:val="28"/>
+          <w:highlight w:val="yellow"/>
+        </w:rPr>
+        <w:t xml:space="preserve"> code for the ADAM optimizer and plots over here with explanation for onion graph vs the history of optimizer steps in the valley.</w:t>
+      </w:r>
+    </w:p>
+    <w:p>
+      <w:pPr>
+        <w:spacing w:after="0"/>
+        <w:jc w:val="both"/>
+        <w:rPr>
+          <w:rFonts w:eastAsiaTheme="minorEastAsia"/>
+          <w:b/>
+          <w:bCs/>
+          <w:sz w:val="26"/>
+          <w:szCs w:val="28"/>
+          <w:highlight w:val="yellow"/>
+        </w:rPr>
+      </w:pPr>
+    </w:p>
+    <w:p>
+      <w:pPr>
+        <w:pStyle w:val="ListParagraph"/>
+        <w:numPr>
+          <w:ilvl w:val="0"/>
+          <w:numId w:val="1"/>
+        </w:numPr>
+        <w:spacing w:after="0"/>
+        <w:jc w:val="both"/>
+        <w:rPr>
+          <w:rFonts w:eastAsiaTheme="minorEastAsia"/>
+          <w:b/>
+          <w:bCs/>
+          <w:sz w:val="26"/>
+          <w:szCs w:val="28"/>
+        </w:rPr>
+      </w:pPr>
+      <w:r>
+        <w:rPr>
+          <w:rFonts w:eastAsiaTheme="minorEastAsia"/>
+          <w:b/>
+          <w:bCs/>
+          <w:sz w:val="26"/>
+          <w:szCs w:val="28"/>
+        </w:rPr>
+        <w:t>Comparison</w:t>
+      </w:r>
+      <w:r>
+        <w:rPr>
+          <w:rFonts w:eastAsiaTheme="minorEastAsia"/>
+          <w:b/>
+          <w:bCs/>
+          <w:sz w:val="26"/>
+          <w:szCs w:val="28"/>
+        </w:rPr>
+        <w:t xml:space="preserve"> with other optimizers</w:t>
+      </w:r>
+      <w:r>
+        <w:rPr>
+          <w:rFonts w:eastAsiaTheme="minorEastAsia"/>
+          <w:b/>
+          <w:bCs/>
+          <w:sz w:val="26"/>
+          <w:szCs w:val="28"/>
         </w:rPr>
         <w:t>:</w:t>
+      </w:r>
+    </w:p>
+    <w:p>
+      <w:pPr>
+        <w:spacing w:after="0"/>
+        <w:jc w:val="both"/>
+        <w:rPr>
+          <w:rFonts w:eastAsiaTheme="minorEastAsia"/>
+          <w:sz w:val="26"/>
+          <w:szCs w:val="28"/>
+        </w:rPr>
+      </w:pPr>
+      <w:r>
+        <w:rPr>
+          <w:rFonts w:eastAsiaTheme="minorEastAsia"/>
+          <w:sz w:val="26"/>
+          <w:szCs w:val="28"/>
+        </w:rPr>
+        <w:t>SGD uses a single global learning rate for all parameters. It requires heavy tuning to work properly.</w:t>
+      </w:r>
+    </w:p>
+    <w:p>
+      <w:pPr>
+        <w:spacing w:after="0"/>
+        <w:jc w:val="both"/>
+        <w:rPr>
+          <w:rFonts w:eastAsiaTheme="minorEastAsia"/>
+          <w:sz w:val="26"/>
+          <w:szCs w:val="28"/>
+        </w:rPr>
+      </w:pPr>
+      <w:proofErr w:type="spellStart"/>
+      <w:r>
+        <w:rPr>
+          <w:rFonts w:eastAsiaTheme="minorEastAsia"/>
+          <w:sz w:val="26"/>
+          <w:szCs w:val="28"/>
+        </w:rPr>
+        <w:t>AdaGrad</w:t>
+      </w:r>
+      <w:proofErr w:type="spellEnd"/>
+      <w:r>
+        <w:rPr>
+          <w:rFonts w:eastAsiaTheme="minorEastAsia"/>
+          <w:sz w:val="26"/>
+          <w:szCs w:val="28"/>
+        </w:rPr>
+        <w:t xml:space="preserve"> gives each parameter its own learning rate, which is great for sparse data. </w:t>
+      </w:r>
+      <w:r>
+        <w:rPr>
+          <w:rFonts w:eastAsiaTheme="minorEastAsia"/>
+          <w:sz w:val="26"/>
+          <w:szCs w:val="28"/>
+        </w:rPr>
+        <w:t>But</w:t>
+      </w:r>
+      <w:r>
+        <w:rPr>
+          <w:rFonts w:eastAsiaTheme="minorEastAsia"/>
+          <w:sz w:val="26"/>
+          <w:szCs w:val="28"/>
+        </w:rPr>
+        <w:t xml:space="preserve"> it keeps accumulating gradients, so the learning rate shrinks to near-zero and training stops too early.</w:t>
+      </w:r>
+    </w:p>
+    <w:p>
+      <w:pPr>
+        <w:spacing w:after="0"/>
+        <w:jc w:val="both"/>
+        <w:rPr>
+          <w:rFonts w:eastAsiaTheme="minorEastAsia"/>
+          <w:sz w:val="26"/>
+          <w:szCs w:val="28"/>
+        </w:rPr>
+      </w:pPr>
+      <w:proofErr w:type="spellStart"/>
+      <w:r>
+        <w:rPr>
+          <w:rFonts w:eastAsiaTheme="minorEastAsia"/>
+          <w:sz w:val="26"/>
+          <w:szCs w:val="28"/>
+        </w:rPr>
+        <w:t>RMSProp</w:t>
+      </w:r>
+      <w:proofErr w:type="spellEnd"/>
+      <w:r>
+        <w:rPr>
+          <w:rFonts w:eastAsiaTheme="minorEastAsia"/>
+          <w:sz w:val="26"/>
+          <w:szCs w:val="28"/>
+        </w:rPr>
+        <w:t xml:space="preserve"> fixes </w:t>
+      </w:r>
+      <w:proofErr w:type="spellStart"/>
+      <w:r>
+        <w:rPr>
+          <w:rFonts w:eastAsiaTheme="minorEastAsia"/>
+          <w:sz w:val="26"/>
+          <w:szCs w:val="28"/>
+        </w:rPr>
+        <w:t>AdaGrad</w:t>
+      </w:r>
+      <w:proofErr w:type="spellEnd"/>
+      <w:r>
+        <w:rPr>
+          <w:rFonts w:eastAsiaTheme="minorEastAsia"/>
+          <w:sz w:val="26"/>
+          <w:szCs w:val="28"/>
+        </w:rPr>
+        <w:t xml:space="preserve"> by using a </w:t>
+      </w:r>
+      <w:r>
+        <w:rPr>
+          <w:rFonts w:eastAsiaTheme="minorEastAsia"/>
+          <w:i/>
+          <w:iCs/>
+          <w:sz w:val="26"/>
+          <w:szCs w:val="28"/>
+        </w:rPr>
+        <w:t>decaying</w:t>
+      </w:r>
+      <w:r>
+        <w:rPr>
+          <w:rFonts w:eastAsiaTheme="minorEastAsia"/>
+          <w:sz w:val="26"/>
+          <w:szCs w:val="28"/>
+        </w:rPr>
+        <w:t xml:space="preserve"> average instead of the full sum, so the learning rate doesn't vanish. But it has no momentum.</w:t>
+      </w:r>
+    </w:p>
+    <w:p>
+      <w:pPr>
+        <w:spacing w:after="0"/>
+        <w:jc w:val="both"/>
+        <w:rPr>
+          <w:rFonts w:eastAsiaTheme="minorEastAsia"/>
+          <w:sz w:val="26"/>
+          <w:szCs w:val="28"/>
+        </w:rPr>
+      </w:pPr>
+      <w:r>
+        <w:rPr>
+          <w:rFonts w:eastAsiaTheme="minorEastAsia"/>
+          <w:sz w:val="26"/>
+          <w:szCs w:val="28"/>
+          <w:highlight w:val="yellow"/>
+        </w:rPr>
+        <w:t xml:space="preserve">Adam = </w:t>
+      </w:r>
+      <w:proofErr w:type="spellStart"/>
+      <w:r>
+        <w:rPr>
+          <w:rFonts w:eastAsiaTheme="minorEastAsia"/>
+          <w:sz w:val="26"/>
+          <w:szCs w:val="28"/>
+          <w:highlight w:val="yellow"/>
+        </w:rPr>
+        <w:t>RMSProp</w:t>
+      </w:r>
+      <w:proofErr w:type="spellEnd"/>
+      <w:r>
+        <w:rPr>
+          <w:rFonts w:eastAsiaTheme="minorEastAsia"/>
+          <w:sz w:val="26"/>
+          <w:szCs w:val="28"/>
+          <w:highlight w:val="yellow"/>
+        </w:rPr>
+        <w:t xml:space="preserve"> + Momentum + Bias Correction. It takes the best of both worlds.</w:t>
+      </w:r>
+    </w:p>
+    <w:p>
+      <w:pPr>
+        <w:spacing w:after="0"/>
+        <w:jc w:val="both"/>
+        <w:rPr>
+          <w:rFonts w:eastAsiaTheme="minorEastAsia"/>
+          <w:b/>
+          <w:bCs/>
+          <w:sz w:val="26"/>
+          <w:szCs w:val="28"/>
+          <w:highlight w:val="yellow"/>
+        </w:rPr>
+      </w:pPr>
+    </w:p>
+    <w:p>
+      <w:pPr>
+        <w:pStyle w:val="ListParagraph"/>
+        <w:numPr>
+          <w:ilvl w:val="0"/>
+          <w:numId w:val="1"/>
+        </w:numPr>
+        <w:spacing w:after="0"/>
+        <w:jc w:val="both"/>
+        <w:rPr>
+          <w:rFonts w:eastAsiaTheme="minorEastAsia"/>
+          <w:b/>
+          <w:bCs/>
+          <w:sz w:val="26"/>
+          <w:szCs w:val="28"/>
+        </w:rPr>
+      </w:pPr>
+      <w:r>
+        <w:rPr>
+          <w:rFonts w:eastAsiaTheme="minorEastAsia"/>
+          <w:b/>
+          <w:bCs/>
+          <w:sz w:val="26"/>
+          <w:szCs w:val="28"/>
+        </w:rPr>
+        <w:t xml:space="preserve"> Advantages of ADAM</w:t>
+      </w:r>
+    </w:p>
+    <w:p>
+      <w:pPr>
+        <w:pStyle w:val="ListParagraph"/>
+        <w:numPr>
+          <w:ilvl w:val="1"/>
+          <w:numId w:val="1"/>
+        </w:numPr>
+        <w:spacing w:after="0"/>
+        <w:jc w:val="both"/>
+        <w:rPr>
+          <w:rFonts w:eastAsiaTheme="minorEastAsia"/>
+          <w:sz w:val="26"/>
+          <w:szCs w:val="28"/>
+        </w:rPr>
+      </w:pPr>
+      <w:r>
+        <w:rPr>
+          <w:rFonts w:eastAsiaTheme="minorEastAsia"/>
+          <w:sz w:val="26"/>
+          <w:szCs w:val="28"/>
+        </w:rPr>
+        <w:t>It works well with almost no hyper parameter tuning as it auto adjusts the learning rates.</w:t>
+      </w:r>
+    </w:p>
+    <w:p>
+      <w:pPr>
+        <w:pStyle w:val="ListParagraph"/>
+        <w:numPr>
+          <w:ilvl w:val="1"/>
+          <w:numId w:val="1"/>
+        </w:numPr>
+        <w:spacing w:after="0"/>
+        <w:jc w:val="both"/>
+        <w:rPr>
+          <w:rFonts w:eastAsiaTheme="minorEastAsia"/>
+          <w:sz w:val="26"/>
+          <w:szCs w:val="28"/>
+        </w:rPr>
+      </w:pPr>
+      <w:r>
+        <w:rPr>
+          <w:rFonts w:eastAsiaTheme="minorEastAsia"/>
+          <w:sz w:val="26"/>
+          <w:szCs w:val="28"/>
+        </w:rPr>
+        <w:t>It converges surprisingly fast as compared to other Optimizers.</w:t>
+      </w:r>
+    </w:p>
+    <w:p>
+      <w:pPr>
+        <w:pStyle w:val="ListParagraph"/>
+        <w:numPr>
+          <w:ilvl w:val="1"/>
+          <w:numId w:val="1"/>
+        </w:numPr>
+        <w:spacing w:after="0"/>
+        <w:jc w:val="both"/>
+        <w:rPr>
+          <w:rFonts w:eastAsiaTheme="minorEastAsia"/>
+          <w:sz w:val="26"/>
+          <w:szCs w:val="28"/>
+        </w:rPr>
+      </w:pPr>
+      <w:r>
+        <w:rPr>
+          <w:rFonts w:eastAsiaTheme="minorEastAsia"/>
+          <w:sz w:val="26"/>
+          <w:szCs w:val="28"/>
+        </w:rPr>
+        <w:lastRenderedPageBreak/>
+        <w:t xml:space="preserve">It provides separate and unique learning rates </w:t>
+      </w:r>
+      <w:proofErr w:type="gramStart"/>
+      <w:r>
+        <w:rPr>
+          <w:rFonts w:eastAsiaTheme="minorEastAsia"/>
+          <w:sz w:val="26"/>
+          <w:szCs w:val="28"/>
+        </w:rPr>
+        <w:t>to</w:t>
+      </w:r>
+      <w:proofErr w:type="gramEnd"/>
+      <w:r>
+        <w:rPr>
+          <w:rFonts w:eastAsiaTheme="minorEastAsia"/>
+          <w:sz w:val="26"/>
+          <w:szCs w:val="28"/>
+        </w:rPr>
+        <w:t xml:space="preserve"> all the parameters for effective learning instead of giving all the parameters the same learning rate.</w:t>
+      </w:r>
+    </w:p>
+    <w:p>
+      <w:pPr>
+        <w:spacing w:after="0"/>
+        <w:jc w:val="both"/>
+        <w:rPr>
+          <w:rFonts w:eastAsiaTheme="minorEastAsia"/>
+          <w:sz w:val="26"/>
+          <w:szCs w:val="28"/>
+        </w:rPr>
+      </w:pPr>
+    </w:p>
+    <w:p>
+      <w:pPr>
+        <w:pStyle w:val="ListParagraph"/>
+        <w:numPr>
+          <w:ilvl w:val="0"/>
+          <w:numId w:val="1"/>
+        </w:numPr>
+        <w:spacing w:after="0"/>
+        <w:jc w:val="both"/>
+        <w:rPr>
+          <w:rFonts w:eastAsiaTheme="minorEastAsia"/>
+          <w:b/>
+          <w:bCs/>
+          <w:sz w:val="26"/>
+          <w:szCs w:val="28"/>
+        </w:rPr>
+      </w:pPr>
+      <w:r>
+        <w:rPr>
+          <w:rFonts w:eastAsiaTheme="minorEastAsia"/>
+          <w:b/>
+          <w:bCs/>
+          <w:sz w:val="26"/>
+          <w:szCs w:val="28"/>
+        </w:rPr>
+        <w:t>Practical Examples</w:t>
+      </w:r>
+    </w:p>
+    <w:p>
+      <w:pPr>
+        <w:pStyle w:val="ListParagraph"/>
+        <w:numPr>
+          <w:ilvl w:val="1"/>
+          <w:numId w:val="1"/>
+        </w:numPr>
+        <w:spacing w:after="0"/>
+        <w:jc w:val="both"/>
+        <w:rPr>
+          <w:rFonts w:eastAsiaTheme="minorEastAsia"/>
+          <w:sz w:val="26"/>
+          <w:szCs w:val="28"/>
+        </w:rPr>
+      </w:pPr>
+      <w:proofErr w:type="spellStart"/>
+      <w:r>
+        <w:rPr>
+          <w:rFonts w:eastAsiaTheme="minorEastAsia"/>
+          <w:sz w:val="26"/>
+          <w:szCs w:val="28"/>
+        </w:rPr>
+        <w:t>AdamW</w:t>
+      </w:r>
+      <w:proofErr w:type="spellEnd"/>
+      <w:r>
+        <w:rPr>
+          <w:rFonts w:eastAsiaTheme="minorEastAsia"/>
+          <w:sz w:val="26"/>
+          <w:szCs w:val="28"/>
+        </w:rPr>
+        <w:t xml:space="preserve"> (Adam + fixed weight decay) is the standard optimizer for training virtually every</w:t>
+      </w:r>
+      <w:r>
+        <w:rPr>
+          <w:rFonts w:eastAsiaTheme="minorEastAsia"/>
+          <w:b/>
+          <w:bCs/>
+          <w:sz w:val="26"/>
+          <w:szCs w:val="28"/>
+        </w:rPr>
+        <w:t xml:space="preserve"> </w:t>
+      </w:r>
+      <w:r>
+        <w:rPr>
+          <w:rFonts w:eastAsiaTheme="minorEastAsia"/>
+          <w:sz w:val="26"/>
+          <w:szCs w:val="28"/>
+        </w:rPr>
+        <w:t xml:space="preserve">modern LLM due to the sparse nature of token embeddings. </w:t>
+      </w:r>
+    </w:p>
+    <w:p>
+      <w:pPr>
+        <w:pStyle w:val="ListParagraph"/>
+        <w:numPr>
+          <w:ilvl w:val="1"/>
+          <w:numId w:val="1"/>
+        </w:numPr>
+        <w:spacing w:after="0"/>
+        <w:jc w:val="both"/>
+        <w:rPr>
+          <w:rFonts w:eastAsiaTheme="minorEastAsia"/>
+          <w:sz w:val="26"/>
+          <w:szCs w:val="28"/>
+        </w:rPr>
+      </w:pPr>
+      <w:r>
+        <w:rPr>
+          <w:rFonts w:eastAsiaTheme="minorEastAsia"/>
+          <w:sz w:val="26"/>
+          <w:szCs w:val="28"/>
+        </w:rPr>
+        <w:t xml:space="preserve">Adam is mostly used for fast prototyping in Image classification (CNNs). Then it is replaced by a well-tuned and customized SGD for a slightly better final accuracy. </w:t>
+      </w:r>
+    </w:p>
+    <w:p>
+      <w:pPr>
+        <w:pStyle w:val="ListParagraph"/>
+        <w:numPr>
+          <w:ilvl w:val="1"/>
+          <w:numId w:val="1"/>
+        </w:numPr>
+        <w:spacing w:after="0"/>
+        <w:jc w:val="both"/>
+        <w:rPr>
+          <w:rFonts w:eastAsiaTheme="minorEastAsia"/>
+          <w:b/>
+          <w:bCs/>
+          <w:sz w:val="26"/>
+          <w:szCs w:val="28"/>
+        </w:rPr>
+      </w:pPr>
+      <w:r>
+        <w:rPr>
+          <w:rFonts w:eastAsiaTheme="minorEastAsia"/>
+          <w:sz w:val="26"/>
+          <w:szCs w:val="28"/>
+        </w:rPr>
+        <w:t>Adam is the default optimizer in</w:t>
+      </w:r>
+      <w:r>
+        <w:rPr>
+          <w:rFonts w:eastAsiaTheme="minorEastAsia"/>
+          <w:b/>
+          <w:bCs/>
+          <w:sz w:val="26"/>
+          <w:szCs w:val="28"/>
+        </w:rPr>
+        <w:t xml:space="preserve"> </w:t>
+      </w:r>
+      <w:r>
+        <w:rPr>
+          <w:rFonts w:eastAsiaTheme="minorEastAsia"/>
+          <w:sz w:val="26"/>
+          <w:szCs w:val="28"/>
+        </w:rPr>
+        <w:t>Generative Adversarial Network (GANs) with a β1 set to instead of 0.9</w:t>
+      </w:r>
+    </w:p>
+    <w:p>
+      <w:pPr>
+        <w:spacing w:after="0"/>
+        <w:jc w:val="both"/>
+        <w:rPr>
+          <w:rFonts w:eastAsiaTheme="minorEastAsia"/>
+          <w:b/>
+          <w:bCs/>
+          <w:sz w:val="26"/>
+          <w:szCs w:val="28"/>
+        </w:rPr>
+      </w:pPr>
+    </w:p>
+    <w:p>
+      <w:pPr>
+        <w:pStyle w:val="ListParagraph"/>
+        <w:numPr>
+          <w:ilvl w:val="0"/>
+          <w:numId w:val="1"/>
+        </w:numPr>
+        <w:spacing w:after="0"/>
+        <w:jc w:val="both"/>
+        <w:rPr>
+          <w:rFonts w:eastAsiaTheme="minorEastAsia"/>
+          <w:b/>
+          <w:bCs/>
+          <w:sz w:val="26"/>
+          <w:szCs w:val="28"/>
+        </w:rPr>
+      </w:pPr>
+      <w:r>
+        <w:rPr>
+          <w:rFonts w:eastAsiaTheme="minorEastAsia"/>
+          <w:b/>
+          <w:bCs/>
+          <w:sz w:val="26"/>
+          <w:szCs w:val="28"/>
+        </w:rPr>
+        <w:t>References</w:t>
+      </w:r>
+    </w:p>
+    <w:p>
+      <w:pPr>
+        <w:spacing w:after="0"/>
+        <w:jc w:val="both"/>
+        <w:rPr>
+          <w:rFonts w:eastAsiaTheme="minorEastAsia"/>
+          <w:b/>
+          <w:bCs/>
+          <w:sz w:val="26"/>
+          <w:szCs w:val="28"/>
+        </w:rPr>
+      </w:pPr>
+      <w:r>
+        <w:rPr>
+          <w:rFonts w:eastAsiaTheme="minorEastAsia"/>
+          <w:b/>
+          <w:bCs/>
+          <w:sz w:val="26"/>
+          <w:szCs w:val="28"/>
+          <w:highlight w:val="yellow"/>
+        </w:rPr>
+        <w:t>Add references</w:t>
       </w:r>
     </w:p>
     <w:sectPr>
@@ -5331,7 +5616,7 @@
   <w:abstractNum w:abstractNumId="0" w15:restartNumberingAfterBreak="0">
     <w:nsid w:val="1ACA5C24"/>
     <w:multiLevelType w:val="hybridMultilevel"/>
-    <w:tmpl w:val="3704F80A"/>
+    <w:tmpl w:val="8F2062E4"/>
     <w:lvl w:ilvl="0" w:tplc="0409000F">
       <w:start w:val="1"/>
       <w:numFmt w:val="decimal"/>
@@ -5344,7 +5629,7 @@
         <w:rFonts w:hint="default"/>
       </w:rPr>
     </w:lvl>
-    <w:lvl w:ilvl="1" w:tplc="04090019" w:tentative="1">
+    <w:lvl w:ilvl="1" w:tplc="04090019">
       <w:start w:val="1"/>
       <w:numFmt w:val="lowerLetter"/>
       <w:lvlText w:val="%2."/>
@@ -6026,6 +6311,7 @@
   <w:style w:type="character" w:default="1" w:styleId="DefaultParagraphFont">
     <w:name w:val="Default Paragraph Font"/>
     <w:uiPriority w:val="1"/>
+    <w:semiHidden/>
     <w:unhideWhenUsed/>
   </w:style>
   <w:style w:type="table" w:default="1" w:styleId="TableNormal">

</xml_diff>